<commit_message>
Added code snippets and Appendix
</commit_message>
<xml_diff>
--- a/Report_Session1.docx
+++ b/Report_Session1.docx
@@ -817,7 +817,35 @@
                 <w:rStyle w:val="Hyperlink"/>
                 <w:noProof/>
               </w:rPr>
-              <w:t>3.2.4 Python Verification with Console Output</w:t>
+              <w:t>3.2.4 Python V</w:t>
+            </w:r>
+            <w:r>
+              <w:rPr>
+                <w:rStyle w:val="Hyperlink"/>
+                <w:noProof/>
+              </w:rPr>
+              <w:t>e</w:t>
+            </w:r>
+            <w:r>
+              <w:rPr>
+                <w:rStyle w:val="Hyperlink"/>
+                <w:noProof/>
+              </w:rPr>
+              <w:t xml:space="preserve">rification </w:t>
+            </w:r>
+            <w:r>
+              <w:rPr>
+                <w:rStyle w:val="Hyperlink"/>
+                <w:noProof/>
+              </w:rPr>
+              <w:t>w</w:t>
+            </w:r>
+            <w:r>
+              <w:rPr>
+                <w:rStyle w:val="Hyperlink"/>
+                <w:noProof/>
+              </w:rPr>
+              <w:t>ith Console Output</w:t>
             </w:r>
             <w:r>
               <w:rPr>
@@ -2079,15 +2107,7 @@
     </w:p>
     <w:p>
       <w:r>
-        <w:t xml:space="preserve">The purpose of this assignment is to explore the use of a variety of sophisticated mathematical techniques to examine the pattern of resource consumption in an urban residential system. The investigation follows a scenario created by Urban Resource Intelligence (URI), a consultancy offering local governments advice on how to enhance the efficiency, sustainability and resilience of urban resource systems. To move on to more complex data science projects, as part of the induction process a mathematical investigation must be undertaken that shows the ability to use the skills learned in the previous subjects, Linear Algebra, Calculus, Probability and Statistics, to a </w:t>
-      </w:r>
-      <w:proofErr w:type="gramStart"/>
-      <w:r>
-        <w:t>real world</w:t>
-      </w:r>
-      <w:proofErr w:type="gramEnd"/>
-      <w:r>
-        <w:t xml:space="preserve"> problem in analytics. The findings are presented for non-technical audiences, in the context of policy and planning, and the focus is on the meaning and implications of the results, rather than on the detail of the procedures.</w:t>
+        <w:t>The purpose of this assignment is to explore the use of a variety of sophisticated mathematical techniques to examine the pattern of resource consumption in an urban residential system. The investigation follows a scenario created by Urban Resource Intelligence (URI), a consultancy offering local governments advice on how to enhance the efficiency, sustainability and resilience of urban resource systems. To move on to more complex data science projects, as part of the induction process a mathematical investigation must be undertaken that shows the ability to use the skills learned in the previous subjects, Linear Algebra, Calculus, Probability and Statistics, to a real world problem in analytics. The findings are presented for non-technical audiences, in the context of policy and planning, and the focus is on the meaning and implications of the results, rather than on the detail of the procedures.</w:t>
       </w:r>
     </w:p>
     <w:p>
@@ -2116,15 +2136,13 @@
     </w:p>
     <w:p>
       <w:r>
-        <w:t xml:space="preserve">This assignment is organized, step-by-step. The approach adopted to each task represents one of the mathematical methods that is appropriate for the nature of the urban resource problem under investigation. The mathematical theory is given first, followed by a typed solution, results checking in Python, a visualization of the results and an interpretation of the results written for non-technical users for each task. Computation and visualization are all performed in Python, making use of the NumPy, </w:t>
-      </w:r>
-      <w:proofErr w:type="spellStart"/>
-      <w:r>
-        <w:t>SymPy</w:t>
-      </w:r>
-      <w:proofErr w:type="spellEnd"/>
-      <w:r>
-        <w:t>, Matplotlib and Seaborn libraries, and screenshots of the computational processes and results are provided as evidence of the work.</w:t>
+        <w:t xml:space="preserve">This assignment is </w:t>
+      </w:r>
+      <w:r>
+        <w:t>organized</w:t>
+      </w:r>
+      <w:r>
+        <w:t xml:space="preserve"> step-by-step. The approach adopted to each task represents one of the mathematical methods that is appropriate for the nature of the urban resource problem under investigation. The mathematical theory is given first, followed by a typed solution, results checking in Python, a visualization of the results and an interpretation of the results written for non-technical users for each task. Computation and visualization are all performed in Python, making use of the NumPy, SymPy, Matplotlib and Seaborn libraries, and screenshots of the computational processes and results are provided as evidence of the work.</w:t>
       </w:r>
     </w:p>
     <w:p>
@@ -2136,11 +2154,9 @@
       <w:r>
         <w:t xml:space="preserve">The second task uses differential calculus to analyses the changing demand for resources in a </w:t>
       </w:r>
-      <w:proofErr w:type="gramStart"/>
-      <w:r>
-        <w:t>high density</w:t>
-      </w:r>
-      <w:proofErr w:type="gramEnd"/>
+      <w:r>
+        <w:t>high-density</w:t>
+      </w:r>
       <w:r>
         <w:t xml:space="preserve"> residential area over time. The first and second derivatives of the demand function are computed to find critical points, determine whether they are maxima or minima, to find out if there are any inflection points, and to find the intervals on which the demand is increasing or decreasing. Using this method, peak and trough periods that are important for operation planning can be identified.</w:t>
       </w:r>
@@ -2171,15 +2187,10 @@
       <w:pPr>
         <w:pStyle w:val="Heading1"/>
       </w:pPr>
-      <w:bookmarkStart w:id="3" w:name="_Toc234281145"/>
-      <w:r>
-        <w:rPr>
-          <w:rFonts w:ascii="Times New Roman" w:hAnsi="Times New Roman"/>
-        </w:rPr>
+      <w:r>
         <w:lastRenderedPageBreak/>
-        <w:t>3. Task 1: Steady-State Resource Demand (Linear Algebra)</w:t>
-      </w:r>
-      <w:bookmarkEnd w:id="3"/>
+        <w:t>Task 1: Steady-State Resource Demand (Linear Algebra)</w:t>
+      </w:r>
     </w:p>
     <w:p>
       <w:pPr>
@@ -2188,21 +2199,29 @@
           <w:rFonts w:ascii="Times New Roman" w:hAnsi="Times New Roman"/>
         </w:rPr>
       </w:pPr>
-      <w:bookmarkStart w:id="4" w:name="_Toc234281146"/>
+      <w:bookmarkStart w:id="3" w:name="_Toc234281146"/>
       <w:r>
         <w:rPr>
           <w:rFonts w:ascii="Times New Roman" w:hAnsi="Times New Roman"/>
         </w:rPr>
         <w:t>3.1 Mathematical Analysis (Method Used: System of Linear Equations and Matrix Algebra)</w:t>
       </w:r>
-      <w:bookmarkEnd w:id="4"/>
+      <w:bookmarkEnd w:id="3"/>
     </w:p>
     <w:p>
       <w:pPr>
         <w:spacing w:after="120"/>
       </w:pPr>
       <w:r>
-        <w:t>The aim is to find the balance between the daily resource needs of the four interconnected cities. A set of four linear equations in four unknowns x1, x2, x3, x4, where x1 is the net daily demand (units) of zone 1, x2 is the net daily demand (units) of zone 2 etc., represents the relationship between the zones.</w:t>
+        <w:t>Students are expected to be able to write a system of linear equations and solve it using matrices and matrix algebra. Students should be able to write a system of linear equations and solve it with matrices and matrix algebra.</w:t>
+      </w:r>
+    </w:p>
+    <w:p>
+      <w:pPr>
+        <w:spacing w:after="120"/>
+      </w:pPr>
+      <w:r>
+        <w:t>The objective is to achieve the balance of the four interrelated cities' daily resource requirements. A set of four linear equations in four unknowns x1, x2, x3, x4, where x1 is the net daily demand (units) of zone 1, x2 is the net daily demand (units) of zone 2 etc., represents the relationship between the zones.</w:t>
       </w:r>
     </w:p>
     <w:p>
@@ -2304,7 +2323,7 @@
         <w:spacing w:after="120"/>
       </w:pPr>
       <w:r>
-        <w:t>The system can be expressed in matrix form as Ax = b:</w:t>
+        <w:t>This can be written as Ax = b:</w:t>
       </w:r>
     </w:p>
     <w:p>
@@ -2484,41 +2503,49 @@
         <w:spacing w:after="120"/>
       </w:pPr>
       <w:r>
-        <w:t>The analysis requires checking three properties of matrix A to ensure a unique, stable solution exists: (1) the determinant should be non-zero (ensures a unique solution), (2) the rank should be equal to the number of equations (ensures full linear independence), and (3) the condition number should be small (indicates numerical stability).</w:t>
+        <w:t>To ensure that a matrix A has a unique, stable solution to its linear system, it is necessary to check three properties: (1) the determinant must not be zero (otherwise there is no unique solution), (2) the rank must equal the number of equations (otherwise the linear system is not full rank, meaning it is not linearly independent), and (3) the condition number must be small (otherwise the solution is not numerically stable).</w:t>
       </w:r>
     </w:p>
     <w:p>
       <w:pPr>
         <w:pStyle w:val="Heading2"/>
       </w:pPr>
-      <w:bookmarkStart w:id="5" w:name="_Toc234281147"/>
+      <w:bookmarkStart w:id="4" w:name="_Toc234281147"/>
       <w:r>
         <w:rPr>
           <w:rFonts w:ascii="Times New Roman" w:hAnsi="Times New Roman"/>
         </w:rPr>
         <w:t>3.2 Solution</w:t>
       </w:r>
-      <w:bookmarkEnd w:id="5"/>
+      <w:bookmarkEnd w:id="4"/>
     </w:p>
     <w:p>
       <w:pPr>
         <w:pStyle w:val="Heading3"/>
       </w:pPr>
-      <w:bookmarkStart w:id="6" w:name="_Toc234281148"/>
+      <w:bookmarkStart w:id="5" w:name="_Toc234281148"/>
       <w:r>
         <w:rPr>
           <w:rFonts w:ascii="Times New Roman" w:hAnsi="Times New Roman"/>
         </w:rPr>
         <w:t>3.2.1 Formation of the Augmented Matrix</w:t>
       </w:r>
-      <w:bookmarkEnd w:id="6"/>
+      <w:bookmarkEnd w:id="5"/>
     </w:p>
     <w:p>
       <w:pPr>
         <w:spacing w:after="120"/>
       </w:pPr>
       <w:r>
-        <w:t>To solve the system using Gaussian elimination, we first construct the augmented matrix [A|b] which combines the coefficient matrix A with the constant vector b.</w:t>
+        <w:t>To obtain the augmented matrix. To form an augmented matrix.</w:t>
+      </w:r>
+    </w:p>
+    <w:p>
+      <w:pPr>
+        <w:spacing w:after="120"/>
+      </w:pPr>
+      <w:r>
+        <w:t>The first step in solving the system with Gaussian elimination is to form the augmented matrix [A|b] that is made up of the coefficient matrix A and the constant vector b.</w:t>
       </w:r>
     </w:p>
     <w:p>
@@ -2624,6 +2651,7 @@
             <w:rPr>
               <w:rFonts w:ascii="Cambria Math" w:hAnsi="Cambria Math"/>
             </w:rPr>
+            <w:lastRenderedPageBreak/>
             <m:t xml:space="preserve">        [0   -1   1    2   | 140]</m:t>
           </m:r>
         </m:oMath>
@@ -2639,14 +2667,14 @@
       <w:pPr>
         <w:pStyle w:val="Heading3"/>
       </w:pPr>
-      <w:bookmarkStart w:id="7" w:name="_Toc234281149"/>
+      <w:bookmarkStart w:id="6" w:name="_Toc234281149"/>
       <w:r>
         <w:rPr>
           <w:rFonts w:ascii="Times New Roman" w:hAnsi="Times New Roman"/>
         </w:rPr>
         <w:t>3.2.2 Gaussian Elimination Step-by-Step</w:t>
       </w:r>
-      <w:bookmarkEnd w:id="7"/>
+      <w:bookmarkEnd w:id="6"/>
     </w:p>
     <w:p>
       <w:pPr>
@@ -2656,7 +2684,13 @@
         <w:rPr>
           <w:b/>
         </w:rPr>
-        <w:t>Step 1: Eliminate x1 from rows 2 and 3 using row 1 as pivot.</w:t>
+        <w:t xml:space="preserve">Step 1: </w:t>
+      </w:r>
+      <w:r>
+        <w:rPr>
+          <w:b/>
+        </w:rPr>
+        <w:t>To eliminate x1 from row 2 and 3 with row 1 as a pivot.</w:t>
       </w:r>
     </w:p>
     <w:p>
@@ -2673,7 +2707,6 @@
             <w:rPr>
               <w:rFonts w:ascii="Cambria Math" w:hAnsi="Cambria Math"/>
             </w:rPr>
-            <w:lastRenderedPageBreak/>
             <m:t xml:space="preserve">Row 2 -&gt; Row 2 + </m:t>
           </m:r>
           <m:d>
@@ -2920,7 +2953,13 @@
         <w:rPr>
           <w:b/>
         </w:rPr>
-        <w:t>Step 2: Eliminate x2 from rows 3 and 4 using row 2 as pivot.</w:t>
+        <w:t xml:space="preserve">Step 2: </w:t>
+      </w:r>
+      <w:r>
+        <w:rPr>
+          <w:b/>
+        </w:rPr>
+        <w:t>Step 2: Make use of row 2 as a pivot to eliminate x2 from rows 3 and 4.</w:t>
       </w:r>
     </w:p>
     <w:p>
@@ -3156,7 +3195,7 @@
         <w:rPr>
           <w:b/>
         </w:rPr>
-        <w:t>Step 3: Eliminate x3 from row 4 using row 3 as pivot.</w:t>
+        <w:t>Step 3: To eliminate x3 from row 4, use row 3 as pivot.</w:t>
       </w:r>
     </w:p>
     <w:p>
@@ -3173,6 +3212,7 @@
             <w:rPr>
               <w:rFonts w:ascii="Cambria Math" w:hAnsi="Cambria Math"/>
             </w:rPr>
+            <w:lastRenderedPageBreak/>
             <m:t>Row 4 -&gt; Row 4 - Row 3:</m:t>
           </m:r>
         </m:oMath>
@@ -3223,7 +3263,6 @@
         <w:spacing w:after="120"/>
       </w:pPr>
       <w:r>
-        <w:lastRenderedPageBreak/>
         <w:t>Final row-echelon form:</w:t>
       </w:r>
     </w:p>
@@ -3314,14 +3353,14 @@
           <w:rFonts w:ascii="Times New Roman" w:hAnsi="Times New Roman"/>
         </w:rPr>
       </w:pPr>
-      <w:bookmarkStart w:id="8" w:name="_Toc234281150"/>
+      <w:bookmarkStart w:id="7" w:name="_Toc234281150"/>
       <w:r>
         <w:rPr>
           <w:rFonts w:ascii="Times New Roman" w:hAnsi="Times New Roman"/>
         </w:rPr>
         <w:t>3.2.3 Back Substitution</w:t>
       </w:r>
-      <w:bookmarkEnd w:id="8"/>
+      <w:bookmarkEnd w:id="7"/>
     </w:p>
     <w:p>
       <w:pPr>
@@ -3846,7 +3885,16 @@
           <w:rPr>
             <w:rFonts w:ascii="Cambria Math" w:hAnsi="Cambria Math"/>
           </w:rPr>
-          <m:t>1 - x2 + x</m:t>
+          <m:t>1 - x</m:t>
+        </m:r>
+        <m:r>
+          <m:rPr>
+            <m:sty m:val="bi"/>
+          </m:rPr>
+          <w:rPr>
+            <w:rFonts w:ascii="Cambria Math" w:hAnsi="Cambria Math"/>
+          </w:rPr>
+          <m:t>2 + x</m:t>
         </m:r>
         <m:r>
           <m:rPr>
@@ -3934,6 +3982,7 @@
             <w:rPr>
               <w:rFonts w:ascii="Cambria Math" w:hAnsi="Cambria Math"/>
             </w:rPr>
+            <w:lastRenderedPageBreak/>
             <m:t>x1 =</m:t>
           </m:r>
           <m:f>
@@ -4021,7 +4070,6 @@
             <w:rPr>
               <w:rFonts w:ascii="Cambria Math" w:hAnsi="Cambria Math"/>
             </w:rPr>
-            <w:lastRenderedPageBreak/>
             <m:t>x2 = 123.33 units/day  (Zone 2)</m:t>
           </m:r>
         </m:oMath>
@@ -4071,26 +4119,25 @@
       <w:pPr>
         <w:pStyle w:val="Heading3"/>
       </w:pPr>
-      <w:bookmarkStart w:id="9" w:name="_Toc234281151"/>
-      <w:r>
+      <w:r>
+        <w:t>3.2.4 Python Verification Output Console</w:t>
+      </w:r>
+    </w:p>
+    <w:p>
+      <w:pPr>
+        <w:spacing w:after="120"/>
+      </w:pPr>
+      <w:r>
+        <w:t>To check the solution, we have used the function: numpy.linalg.solve. The complete Python source code and its output from the console are given below:</w:t>
+      </w:r>
+    </w:p>
+    <w:p>
+      <w:pPr>
+        <w:spacing w:after="120"/>
         <w:rPr>
-          <w:rFonts w:ascii="Times New Roman" w:hAnsi="Times New Roman"/>
+          <w:b/>
+          <w:sz w:val="20"/>
         </w:rPr>
-        <w:t>3.2.4 Python Verification with Console Output</w:t>
-      </w:r>
-      <w:bookmarkEnd w:id="9"/>
-    </w:p>
-    <w:p>
-      <w:pPr>
-        <w:spacing w:after="120"/>
-      </w:pPr>
-      <w:r>
-        <w:t>We used numpy.linalg.solve to verify the solution. The full Python code and its executed console output are shown below:</w:t>
-      </w:r>
-    </w:p>
-    <w:p>
-      <w:pPr>
-        <w:spacing w:after="120"/>
       </w:pPr>
       <w:r>
         <w:rPr>
@@ -4098,6 +4145,48 @@
           <w:sz w:val="20"/>
         </w:rPr>
         <w:t>Python Script (code/task1_linear_algebra.py):</w:t>
+      </w:r>
+    </w:p>
+    <w:p>
+      <w:pPr>
+        <w:spacing w:after="120"/>
+      </w:pPr>
+      <w:r>
+        <w:drawing>
+          <wp:inline distT="0" distB="0" distL="0" distR="0" wp14:anchorId="570DC92C" wp14:editId="3EB07BC8">
+            <wp:extent cx="3743325" cy="3767154"/>
+            <wp:effectExtent l="0" t="0" r="0" b="5080"/>
+            <wp:docPr id="1148515986" name="Picture 1"/>
+            <wp:cNvGraphicFramePr>
+              <a:graphicFrameLocks xmlns:a="http://schemas.openxmlformats.org/drawingml/2006/main" noChangeAspect="1"/>
+            </wp:cNvGraphicFramePr>
+            <a:graphic xmlns:a="http://schemas.openxmlformats.org/drawingml/2006/main">
+              <a:graphicData uri="http://schemas.openxmlformats.org/drawingml/2006/picture">
+                <pic:pic xmlns:pic="http://schemas.openxmlformats.org/drawingml/2006/picture">
+                  <pic:nvPicPr>
+                    <pic:cNvPr id="1148515986" name=""/>
+                    <pic:cNvPicPr/>
+                  </pic:nvPicPr>
+                  <pic:blipFill>
+                    <a:blip r:embed="rId8"/>
+                    <a:stretch>
+                      <a:fillRect/>
+                    </a:stretch>
+                  </pic:blipFill>
+                  <pic:spPr>
+                    <a:xfrm>
+                      <a:off x="0" y="0"/>
+                      <a:ext cx="3759924" cy="3783858"/>
+                    </a:xfrm>
+                    <a:prstGeom prst="rect">
+                      <a:avLst/>
+                    </a:prstGeom>
+                  </pic:spPr>
+                </pic:pic>
+              </a:graphicData>
+            </a:graphic>
+          </wp:inline>
+        </w:drawing>
       </w:r>
     </w:p>
     <w:p>
@@ -4124,10 +4213,7 @@
         <w:spacing w:after="120"/>
       </w:pPr>
       <w:r>
-        <w:rPr>
-          <w:b/>
-        </w:rPr>
-        <w:t>Summary of matrix properties:</w:t>
+        <w:t>List of properties of matrices:</w:t>
       </w:r>
     </w:p>
     <w:tbl>
@@ -4296,6 +4382,7 @@
               <w:rPr>
                 <w:sz w:val="22"/>
               </w:rPr>
+              <w:lastRenderedPageBreak/>
               <w:t>Condition number</w:t>
             </w:r>
           </w:p>
@@ -4392,7 +4479,7 @@
         <w:spacing w:after="120"/>
       </w:pPr>
       <w:r>
-        <w:t>The determinant is 12.00 (non-zero), confirming that matrix A is invertible and a unique solution exists. The matrix has full rank (4), meaning all four equations are linearly independent. The condition number of 7.92 is well below 100, indicating the system is well-conditioned. The maximum residual of 2.84e-14 confirms the solution satisfies the original system to within machine precision.</w:t>
+        <w:t>The determinant is 12.00 (which is not 0), so matrix A is invertible and there is 1 solution. The four equations are linearly independent and thus the matrix has rank 4. The condition number 7.92 is quite low, below 100, so the system is well-conditioned. The norm of the residual gives the accuracy of the solution within machine precision: 2.84e-14.</w:t>
       </w:r>
     </w:p>
     <w:p>
@@ -4402,14 +4489,14 @@
           <w:rFonts w:ascii="Times New Roman" w:hAnsi="Times New Roman"/>
         </w:rPr>
       </w:pPr>
-      <w:bookmarkStart w:id="10" w:name="_Toc234281152"/>
+      <w:bookmarkStart w:id="8" w:name="_Toc234281152"/>
       <w:r>
         <w:rPr>
           <w:rFonts w:ascii="Times New Roman" w:hAnsi="Times New Roman"/>
         </w:rPr>
         <w:t>3.3 Analysis and Results</w:t>
       </w:r>
-      <w:bookmarkEnd w:id="10"/>
+      <w:bookmarkEnd w:id="8"/>
     </w:p>
     <w:p>
       <w:r>
@@ -4418,30 +4505,21 @@
     </w:p>
     <w:p>
       <w:r>
-        <w:t xml:space="preserve">The important urban planning implication is that the distribution of resources has a single predictable steady state. Resources can be allocated with absolute certainty in proportion to the users' needs. The demand in Zone 2 is the highest (roughly 3.7 times Zone 3) indicating it is a high density residential/commercial area. Low demand in Zone 3 may be for a green zone or </w:t>
-      </w:r>
-      <w:proofErr w:type="gramStart"/>
-      <w:r>
-        <w:t>low density</w:t>
-      </w:r>
-      <w:proofErr w:type="gramEnd"/>
-      <w:r>
-        <w:t xml:space="preserve"> residential area.</w:t>
+        <w:t>The important urban planning implication is that the distribution of resources has a single predictable steady state. Resources can be allocated with absolute certainty in proportion to the users' needs. The demand in Zone 2 is the highest (roughly 3.7 times Zone 3) indicating it is a high density residential/commercial area. Low demand in Zone 3 may be for a green zone or low density residential area.</w:t>
       </w:r>
     </w:p>
     <w:p>
       <w:pPr>
         <w:pStyle w:val="Heading2"/>
       </w:pPr>
-      <w:bookmarkStart w:id="11" w:name="_Toc234281153"/>
+      <w:bookmarkStart w:id="9" w:name="_Toc234281153"/>
       <w:r>
         <w:rPr>
           <w:rFonts w:ascii="Times New Roman" w:hAnsi="Times New Roman"/>
         </w:rPr>
-        <w:lastRenderedPageBreak/>
         <w:t xml:space="preserve">3.4 </w:t>
       </w:r>
-      <w:bookmarkEnd w:id="11"/>
+      <w:bookmarkEnd w:id="9"/>
       <w:r>
         <w:rPr>
           <w:rFonts w:ascii="Times New Roman" w:hAnsi="Times New Roman"/>
@@ -4473,7 +4551,7 @@
                     <pic:cNvPicPr/>
                   </pic:nvPicPr>
                   <pic:blipFill>
-                    <a:blip r:embed="rId6"/>
+                    <a:blip r:embed="rId9"/>
                     <a:stretch>
                       <a:fillRect/>
                     </a:stretch>
@@ -4527,7 +4605,7 @@
         <w:spacing w:after="120"/>
       </w:pPr>
       <w:r>
-        <w:t>The equilibrium demand of each zone is represented as a bar graph in Figure 1. Zone 2 (123.33 units/day) has the highest demand, while Zone 3 (33.33 units/day) has the lowest. The average demand line (106.67 units/day) helps planners visualise which zones are above or below average.</w:t>
+        <w:t>A bar graph of the equilibrium demand for each zone is shown in Figure 1. The highest demand is for Zone 2 (123.33 units/day) and the lowest for Zone 3 (33.33 units/day). The average demand line (106.67 units/day) conveys the planner an overview of whether the zones are above or below average.</w:t>
       </w:r>
     </w:p>
     <w:p>
@@ -4539,7 +4617,7 @@
       <w:pPr>
         <w:pStyle w:val="Heading1"/>
       </w:pPr>
-      <w:bookmarkStart w:id="12" w:name="_Toc234281154"/>
+      <w:bookmarkStart w:id="10" w:name="_Toc234281154"/>
       <w:r>
         <w:rPr>
           <w:rFonts w:ascii="Times New Roman" w:hAnsi="Times New Roman"/>
@@ -4547,7 +4625,7 @@
         <w:lastRenderedPageBreak/>
         <w:t>4. Task 2: Demand Over Time (Calculus)</w:t>
       </w:r>
-      <w:bookmarkEnd w:id="12"/>
+      <w:bookmarkEnd w:id="10"/>
     </w:p>
     <w:p>
       <w:pPr>
@@ -4556,14 +4634,14 @@
           <w:rFonts w:ascii="Times New Roman" w:hAnsi="Times New Roman"/>
         </w:rPr>
       </w:pPr>
-      <w:bookmarkStart w:id="13" w:name="_Toc234281155"/>
+      <w:bookmarkStart w:id="11" w:name="_Toc234281155"/>
       <w:r>
         <w:rPr>
           <w:rFonts w:ascii="Times New Roman" w:hAnsi="Times New Roman"/>
         </w:rPr>
         <w:t>4.1 Mathematical Analysis (Method Used: Differential Calculus)</w:t>
       </w:r>
-      <w:bookmarkEnd w:id="13"/>
+      <w:bookmarkEnd w:id="11"/>
     </w:p>
     <w:p>
       <w:r>
@@ -4679,27 +4757,27 @@
       <w:pPr>
         <w:pStyle w:val="Heading2"/>
       </w:pPr>
-      <w:bookmarkStart w:id="14" w:name="_Toc234281156"/>
+      <w:bookmarkStart w:id="12" w:name="_Toc234281156"/>
       <w:r>
         <w:rPr>
           <w:rFonts w:ascii="Times New Roman" w:hAnsi="Times New Roman"/>
         </w:rPr>
         <w:t>4.2 Solution</w:t>
       </w:r>
-      <w:bookmarkEnd w:id="14"/>
+      <w:bookmarkEnd w:id="12"/>
     </w:p>
     <w:p>
       <w:pPr>
         <w:pStyle w:val="Heading3"/>
       </w:pPr>
-      <w:bookmarkStart w:id="15" w:name="_Toc234281157"/>
+      <w:bookmarkStart w:id="13" w:name="_Toc234281157"/>
       <w:r>
         <w:rPr>
           <w:rFonts w:ascii="Times New Roman" w:hAnsi="Times New Roman"/>
         </w:rPr>
         <w:t>4.2.1 Application of the Power Rule for Differentiation</w:t>
       </w:r>
-      <w:bookmarkEnd w:id="15"/>
+      <w:bookmarkEnd w:id="13"/>
     </w:p>
     <w:p>
       <w:pPr>
@@ -5227,14 +5305,14 @@
       <w:pPr>
         <w:pStyle w:val="Heading3"/>
       </w:pPr>
-      <w:bookmarkStart w:id="16" w:name="_Toc234281158"/>
+      <w:bookmarkStart w:id="14" w:name="_Toc234281158"/>
       <w:r>
         <w:rPr>
           <w:rFonts w:ascii="Times New Roman" w:hAnsi="Times New Roman"/>
         </w:rPr>
         <w:t>4.2.2 Identification of Critical Points</w:t>
       </w:r>
-      <w:bookmarkEnd w:id="16"/>
+      <w:bookmarkEnd w:id="14"/>
     </w:p>
     <w:p>
       <w:pPr>
@@ -5435,14 +5513,14 @@
       <w:pPr>
         <w:pStyle w:val="Heading3"/>
       </w:pPr>
-      <w:bookmarkStart w:id="17" w:name="_Toc234281159"/>
+      <w:bookmarkStart w:id="15" w:name="_Toc234281159"/>
       <w:r>
         <w:rPr>
           <w:rFonts w:ascii="Times New Roman" w:hAnsi="Times New Roman"/>
         </w:rPr>
         <w:t>4.2.3 Second Derivative Test for Classification</w:t>
       </w:r>
-      <w:bookmarkEnd w:id="17"/>
+      <w:bookmarkEnd w:id="15"/>
     </w:p>
     <w:p>
       <w:pPr>
@@ -5892,14 +5970,14 @@
           <w:rFonts w:ascii="Times New Roman" w:hAnsi="Times New Roman"/>
         </w:rPr>
       </w:pPr>
-      <w:bookmarkStart w:id="18" w:name="_Toc234281160"/>
+      <w:bookmarkStart w:id="16" w:name="_Toc234281160"/>
       <w:r>
         <w:rPr>
           <w:rFonts w:ascii="Times New Roman" w:hAnsi="Times New Roman"/>
         </w:rPr>
         <w:t>4.2.4 Inflection Point Analysis</w:t>
       </w:r>
-      <w:bookmarkEnd w:id="18"/>
+      <w:bookmarkEnd w:id="16"/>
     </w:p>
     <w:p>
       <w:pPr>
@@ -6166,14 +6244,14 @@
           <w:rFonts w:ascii="Times New Roman" w:hAnsi="Times New Roman"/>
         </w:rPr>
       </w:pPr>
-      <w:bookmarkStart w:id="19" w:name="_Toc234281161"/>
+      <w:bookmarkStart w:id="17" w:name="_Toc234281161"/>
       <w:r>
         <w:rPr>
           <w:rFonts w:ascii="Times New Roman" w:hAnsi="Times New Roman"/>
         </w:rPr>
         <w:t>4.2.5 Intervals of Increase and Decrease</w:t>
       </w:r>
-      <w:bookmarkEnd w:id="19"/>
+      <w:bookmarkEnd w:id="17"/>
     </w:p>
     <w:p/>
     <w:tbl>
@@ -6457,7 +6535,6 @@
                     <w:rFonts w:ascii="Cambria Math" w:hAnsi="Cambria Math"/>
                     <w:sz w:val="22"/>
                   </w:rPr>
-                  <w:lastRenderedPageBreak/>
                   <m:t>t &gt; 2</m:t>
                 </m:r>
               </m:oMath>
@@ -6541,14 +6618,14 @@
       <w:pPr>
         <w:pStyle w:val="Heading3"/>
       </w:pPr>
-      <w:bookmarkStart w:id="20" w:name="_Toc234281162"/>
+      <w:bookmarkStart w:id="18" w:name="_Toc234281162"/>
       <w:r>
         <w:rPr>
           <w:rFonts w:ascii="Times New Roman" w:hAnsi="Times New Roman"/>
         </w:rPr>
         <w:t>4.2.6 Python Verification with Console Output</w:t>
       </w:r>
-      <w:bookmarkEnd w:id="20"/>
+      <w:bookmarkEnd w:id="18"/>
     </w:p>
     <w:p>
       <w:pPr>
@@ -6556,6 +6633,48 @@
       </w:pPr>
       <w:r>
         <w:t xml:space="preserve">The symbolic computation of derivatives and the solving of critical points was done using SymPy. </w:t>
+      </w:r>
+    </w:p>
+    <w:p>
+      <w:pPr>
+        <w:spacing w:after="120"/>
+      </w:pPr>
+      <w:r>
+        <w:drawing>
+          <wp:inline distT="0" distB="0" distL="0" distR="0" wp14:anchorId="30E58FF0" wp14:editId="2DAB0C2A">
+            <wp:extent cx="5486400" cy="4787900"/>
+            <wp:effectExtent l="0" t="0" r="0" b="0"/>
+            <wp:docPr id="141949325" name="Picture 1"/>
+            <wp:cNvGraphicFramePr>
+              <a:graphicFrameLocks xmlns:a="http://schemas.openxmlformats.org/drawingml/2006/main" noChangeAspect="1"/>
+            </wp:cNvGraphicFramePr>
+            <a:graphic xmlns:a="http://schemas.openxmlformats.org/drawingml/2006/main">
+              <a:graphicData uri="http://schemas.openxmlformats.org/drawingml/2006/picture">
+                <pic:pic xmlns:pic="http://schemas.openxmlformats.org/drawingml/2006/picture">
+                  <pic:nvPicPr>
+                    <pic:cNvPr id="141949325" name=""/>
+                    <pic:cNvPicPr/>
+                  </pic:nvPicPr>
+                  <pic:blipFill>
+                    <a:blip r:embed="rId10"/>
+                    <a:stretch>
+                      <a:fillRect/>
+                    </a:stretch>
+                  </pic:blipFill>
+                  <pic:spPr>
+                    <a:xfrm>
+                      <a:off x="0" y="0"/>
+                      <a:ext cx="5486400" cy="4787900"/>
+                    </a:xfrm>
+                    <a:prstGeom prst="rect">
+                      <a:avLst/>
+                    </a:prstGeom>
+                  </pic:spPr>
+                </pic:pic>
+              </a:graphicData>
+            </a:graphic>
+          </wp:inline>
+        </w:drawing>
       </w:r>
     </w:p>
     <w:p>
@@ -6565,14 +6684,14 @@
           <w:rFonts w:ascii="Times New Roman" w:hAnsi="Times New Roman"/>
         </w:rPr>
       </w:pPr>
-      <w:bookmarkStart w:id="21" w:name="_Toc234281163"/>
+      <w:bookmarkStart w:id="19" w:name="_Toc234281163"/>
       <w:r>
         <w:rPr>
           <w:rFonts w:ascii="Times New Roman" w:hAnsi="Times New Roman"/>
         </w:rPr>
         <w:t>4.3 Analysis and Results</w:t>
       </w:r>
-      <w:bookmarkEnd w:id="21"/>
+      <w:bookmarkEnd w:id="19"/>
     </w:p>
     <w:p>
       <w:r>
@@ -6581,7 +6700,11 @@
     </w:p>
     <w:p>
       <w:r>
-        <w:t>Of particular interest is the inflection point at t = 1.5 hours - the rate of decrease is itself decreasing, thereby indicating that the system will begin to recover even prior to the beginning of the demand increase at t = 2 hours. This is a useful early warning system that works for automated resource management systems.</w:t>
+        <w:t xml:space="preserve">Of particular interest is the inflection point at t = 1.5 hours - the rate of decrease is itself decreasing, thereby indicating that the system will begin to recover even prior to the </w:t>
+      </w:r>
+      <w:r>
+        <w:lastRenderedPageBreak/>
+        <w:t>beginning of the demand increase at t = 2 hours. This is a useful early warning system that works for automated resource management systems.</w:t>
       </w:r>
     </w:p>
     <w:p>
@@ -6593,15 +6716,14 @@
       <w:pPr>
         <w:pStyle w:val="Heading2"/>
       </w:pPr>
-      <w:bookmarkStart w:id="22" w:name="_Toc234281164"/>
+      <w:bookmarkStart w:id="20" w:name="_Toc234281164"/>
       <w:r>
         <w:rPr>
           <w:rFonts w:ascii="Times New Roman" w:hAnsi="Times New Roman"/>
         </w:rPr>
-        <w:lastRenderedPageBreak/>
         <w:t xml:space="preserve">4.4 </w:t>
       </w:r>
-      <w:bookmarkEnd w:id="22"/>
+      <w:bookmarkEnd w:id="20"/>
       <w:r>
         <w:rPr>
           <w:rFonts w:ascii="Times New Roman" w:hAnsi="Times New Roman"/>
@@ -6633,7 +6755,7 @@
                     <pic:cNvPicPr/>
                   </pic:nvPicPr>
                   <pic:blipFill>
-                    <a:blip r:embed="rId7"/>
+                    <a:blip r:embed="rId11"/>
                     <a:stretch>
                       <a:fillRect/>
                     </a:stretch>
@@ -6695,7 +6817,7 @@
       <w:pPr>
         <w:pStyle w:val="Heading1"/>
       </w:pPr>
-      <w:bookmarkStart w:id="23" w:name="_Toc234281165"/>
+      <w:bookmarkStart w:id="21" w:name="_Toc234281165"/>
       <w:r>
         <w:rPr>
           <w:rFonts w:ascii="Times New Roman" w:hAnsi="Times New Roman"/>
@@ -6703,46 +6825,53 @@
         <w:lastRenderedPageBreak/>
         <w:t>10. References</w:t>
       </w:r>
-      <w:bookmarkEnd w:id="23"/>
-    </w:p>
-    <w:p>
-      <w:pPr>
-        <w:ind w:left="720" w:hanging="720"/>
-      </w:pPr>
+      <w:bookmarkEnd w:id="21"/>
+    </w:p>
+    <w:p>
+      <w:r>
+        <w:rPr>
+          <w:b/>
+        </w:rPr>
+        <w:t>Task 1: Linear Algebra</w:t>
+      </w:r>
+    </w:p>
+    <w:p>
       <w:r>
         <w:t xml:space="preserve">Anton, H., Rorres, C. and Kaul, A. (2014) Elementary Linear Algebra: Applications Version. 11th </w:t>
       </w:r>
-      <w:proofErr w:type="spellStart"/>
       <w:r>
         <w:t>edn</w:t>
       </w:r>
-      <w:proofErr w:type="spellEnd"/>
       <w:r>
         <w:t>. Hoboken: Wiley.</w:t>
       </w:r>
     </w:p>
     <w:p>
-      <w:pPr>
-        <w:ind w:left="720" w:hanging="720"/>
-      </w:pPr>
+      <w:r>
+        <w:t>Meyer, C.D. (2000) Matrix Analysis and Applied Linear Algebra. Philadelphia: SIAM.</w:t>
+      </w:r>
+    </w:p>
+    <w:p>
+      <w:r>
+        <w:t>Strang, G. (2016) Introduction to Linear Algebra. 5th edn. Wellesley: Wellesley-Cambridge Press.</w:t>
+      </w:r>
+    </w:p>
+    <w:p>
+      <w:r>
+        <w:rPr>
+          <w:b/>
+        </w:rPr>
+        <w:t>Task 2: Calculus</w:t>
+      </w:r>
+    </w:p>
+    <w:p>
       <w:r>
         <w:t>Stewart, J. (2016) Calculus: Early Transcendentals. 8th edn. Boston: Cengage Learning.</w:t>
       </w:r>
     </w:p>
     <w:p>
-      <w:pPr>
-        <w:ind w:left="720" w:hanging="720"/>
-      </w:pPr>
-      <w:r>
-        <w:t xml:space="preserve">Thomas, G.B., Weir, M.D. and Hass, J. (2018) Thomas' Calculus. 14th </w:t>
-      </w:r>
-      <w:proofErr w:type="spellStart"/>
-      <w:r>
-        <w:t>edn</w:t>
-      </w:r>
-      <w:proofErr w:type="spellEnd"/>
-      <w:r>
-        <w:t>. Boston: Pearson.</w:t>
+      <w:r>
+        <w:t>Thomas, G.B., Weir, M.D. and Hass, J. (2018) Thomas' Calculus. 14th edn. Boston: Pearson.</w:t>
       </w:r>
     </w:p>
     <w:p>
@@ -6754,7 +6883,7 @@
       <w:pPr>
         <w:pStyle w:val="Heading1"/>
       </w:pPr>
-      <w:bookmarkStart w:id="24" w:name="_Toc234281166"/>
+      <w:bookmarkStart w:id="22" w:name="_Toc234281166"/>
       <w:r>
         <w:rPr>
           <w:rFonts w:ascii="Times New Roman" w:hAnsi="Times New Roman"/>
@@ -6762,7 +6891,7 @@
         <w:lastRenderedPageBreak/>
         <w:t>11. Appendix</w:t>
       </w:r>
-      <w:bookmarkEnd w:id="24"/>
+      <w:bookmarkEnd w:id="22"/>
     </w:p>
     <w:p>
       <w:pPr>
@@ -6778,28 +6907,2514 @@
     <w:p>
       <w:pPr>
         <w:pStyle w:val="Heading2"/>
-      </w:pPr>
-      <w:bookmarkStart w:id="25" w:name="_Toc234281167"/>
+        <w:rPr>
+          <w:rFonts w:ascii="Times New Roman" w:hAnsi="Times New Roman"/>
+        </w:rPr>
+      </w:pPr>
+      <w:bookmarkStart w:id="23" w:name="_Toc234281167"/>
       <w:r>
         <w:rPr>
           <w:rFonts w:ascii="Times New Roman" w:hAnsi="Times New Roman"/>
         </w:rPr>
         <w:t>Task 1: Linear Algebra</w:t>
       </w:r>
-      <w:bookmarkEnd w:id="25"/>
-    </w:p>
+      <w:bookmarkEnd w:id="23"/>
+    </w:p>
+    <w:p>
+      <w:r>
+        <w:t>"""</w:t>
+      </w:r>
+    </w:p>
+    <w:p>
+      <w:r>
+        <w:t>Task 1 - Steady-State Resource Demand (Linear Algebra)</w:t>
+      </w:r>
+    </w:p>
+    <w:p>
+      <w:r>
+        <w:t>COM7023 Maths for Data Science - Urban Resource Intelligence</w:t>
+      </w:r>
+    </w:p>
+    <w:p/>
+    <w:p>
+      <w:r>
+        <w:t>Solves the 4x4 linear system:</w:t>
+      </w:r>
+    </w:p>
+    <w:p>
+      <w:r>
+        <w:t>  2x1 -  x2 +  x3       = 120</w:t>
+      </w:r>
+    </w:p>
+    <w:p>
+      <w:r>
+        <w:t>  -x1 + 3x2       - x4  = 150</w:t>
+      </w:r>
+    </w:p>
+    <w:p>
+      <w:r>
+        <w:t>   x1 +  x2 + 2x3 - x4  = 180</w:t>
+      </w:r>
+    </w:p>
+    <w:p>
+      <w:r>
+        <w:t>        -x2 +  x3 + 2x4 = 140</w:t>
+      </w:r>
+    </w:p>
+    <w:p/>
+    <w:p>
+      <w:r>
+        <w:t>Interprets x1..x4 as equilibrium daily demand per zone.</w:t>
+      </w:r>
+    </w:p>
+    <w:p>
+      <w:r>
+        <w:t>"""</w:t>
+      </w:r>
+    </w:p>
+    <w:p/>
+    <w:p>
+      <w:r>
+        <w:t>import numpy as np</w:t>
+      </w:r>
+    </w:p>
+    <w:p>
+      <w:r>
+        <w:t>import seaborn as sns</w:t>
+      </w:r>
+    </w:p>
+    <w:p>
+      <w:r>
+        <w:t>import matplotlib.pyplot as plt</w:t>
+      </w:r>
+    </w:p>
+    <w:p/>
+    <w:p>
+      <w:r>
+        <w:t># ============================================================</w:t>
+      </w:r>
+    </w:p>
+    <w:p>
+      <w:r>
+        <w:t># 1. SETUP: Define the system Ax = b</w:t>
+      </w:r>
+    </w:p>
+    <w:p>
+      <w:r>
+        <w:t># ============================================================</w:t>
+      </w:r>
+    </w:p>
+    <w:p/>
+    <w:p>
+      <w:r>
+        <w:t># Coefficient matrix A (4x4)</w:t>
+      </w:r>
+    </w:p>
+    <w:p>
+      <w:r>
+        <w:t>A = np.array([</w:t>
+      </w:r>
+    </w:p>
+    <w:p>
+      <w:r>
+        <w:lastRenderedPageBreak/>
+        <w:t>    [ 2, -1,  1,  0],</w:t>
+      </w:r>
+    </w:p>
+    <w:p>
+      <w:r>
+        <w:t>    [-1,  3,  0, -1],</w:t>
+      </w:r>
+    </w:p>
+    <w:p>
+      <w:r>
+        <w:t>    [ 1,  1,  2, -1],</w:t>
+      </w:r>
+    </w:p>
+    <w:p>
+      <w:r>
+        <w:t>    [ 0, -1,  1,  2]</w:t>
+      </w:r>
+    </w:p>
+    <w:p>
+      <w:r>
+        <w:t>], dtype=float)</w:t>
+      </w:r>
+    </w:p>
+    <w:p/>
+    <w:p>
+      <w:r>
+        <w:t># Right-hand side vector b</w:t>
+      </w:r>
+    </w:p>
+    <w:p>
+      <w:r>
+        <w:t>b = np.array([120, 150, 180, 140], dtype=float)</w:t>
+      </w:r>
+    </w:p>
+    <w:p/>
+    <w:p>
+      <w:r>
+        <w:t>print("=" * 60)</w:t>
+      </w:r>
+    </w:p>
+    <w:p>
+      <w:r>
+        <w:t>print("TASK 1 - STEADY-STATE RESOURCE DEMAND")</w:t>
+      </w:r>
+    </w:p>
+    <w:p>
+      <w:r>
+        <w:t>print("=" * 60)</w:t>
+      </w:r>
+    </w:p>
+    <w:p/>
+    <w:p>
+      <w:r>
+        <w:t>print("\nMatrix A (coefficients):")</w:t>
+      </w:r>
+    </w:p>
+    <w:p>
+      <w:r>
+        <w:t>print(A)</w:t>
+      </w:r>
+    </w:p>
+    <w:p>
+      <w:r>
+        <w:t>print("\nVector b (demand targets):")</w:t>
+      </w:r>
+    </w:p>
+    <w:p>
+      <w:r>
+        <w:t>print(b)</w:t>
+      </w:r>
+    </w:p>
+    <w:p/>
+    <w:p>
+      <w:r>
+        <w:t># ============================================================</w:t>
+      </w:r>
+    </w:p>
+    <w:p>
+      <w:r>
+        <w:t># 2. CHECK EXISTENCE &amp; UNIQUENESS OF SOLUTION</w:t>
+      </w:r>
+    </w:p>
+    <w:p>
+      <w:r>
+        <w:t># ============================================================</w:t>
+      </w:r>
+    </w:p>
+    <w:p/>
+    <w:p>
+      <w:r>
+        <w:t># 2a. Determinant - must be non-zero for a unique solution</w:t>
+      </w:r>
+    </w:p>
+    <w:p>
+      <w:r>
+        <w:t>det_A = np.linalg.det(A)</w:t>
+      </w:r>
+    </w:p>
+    <w:p>
+      <w:r>
+        <w:t>print("\n" + "-" * 50)</w:t>
+      </w:r>
+    </w:p>
+    <w:p>
+      <w:r>
+        <w:lastRenderedPageBreak/>
+        <w:t>print("EXISTENCE &amp; UNIQUENESS CHECKS")</w:t>
+      </w:r>
+    </w:p>
+    <w:p>
+      <w:r>
+        <w:t>print("-" * 50)</w:t>
+      </w:r>
+    </w:p>
+    <w:p>
+      <w:r>
+        <w:t>print(f"det(A) = {det_A:.4f}")</w:t>
+      </w:r>
+    </w:p>
+    <w:p>
+      <w:r>
+        <w:t>if det_A != 0:</w:t>
+      </w:r>
+    </w:p>
+    <w:p>
+      <w:r>
+        <w:t>    print("=&gt; det(A) != 0 -&gt; A is invertible, so a UNIQUE solution exists.")</w:t>
+      </w:r>
+    </w:p>
+    <w:p>
+      <w:r>
+        <w:t>else:</w:t>
+      </w:r>
+    </w:p>
+    <w:p>
+      <w:r>
+        <w:t>    print("=&gt; det(A) = 0 -&gt; System may have no solution or infinitely many.")</w:t>
+      </w:r>
+    </w:p>
+    <w:p/>
+    <w:p>
+      <w:r>
+        <w:t># 2b. Rank - full rank confirms linear independence</w:t>
+      </w:r>
+    </w:p>
+    <w:p>
+      <w:r>
+        <w:t>rank_A = np.linalg.matrix_rank(A)</w:t>
+      </w:r>
+    </w:p>
+    <w:p>
+      <w:r>
+        <w:t>print(f"\nrank(A) = {rank_A}")</w:t>
+      </w:r>
+    </w:p>
+    <w:p>
+      <w:r>
+        <w:t>print(f"Matrix size: {A.shape[0]}x{A.shape[1]}")</w:t>
+      </w:r>
+    </w:p>
+    <w:p>
+      <w:r>
+        <w:t>if rank_A == A.shape[0]:</w:t>
+      </w:r>
+    </w:p>
+    <w:p>
+      <w:r>
+        <w:t>    print("=&gt; Full rank -&gt; all rows are linearly independent.")</w:t>
+      </w:r>
+    </w:p>
+    <w:p>
+      <w:r>
+        <w:t>else:</w:t>
+      </w:r>
+    </w:p>
+    <w:p>
+      <w:r>
+        <w:t>    print("=&gt; Rank deficient -&gt; some equations may be redundant.")</w:t>
+      </w:r>
+    </w:p>
+    <w:p/>
+    <w:p>
+      <w:r>
+        <w:t># 2c. Condition number - numerical stability</w:t>
+      </w:r>
+    </w:p>
+    <w:p>
+      <w:r>
+        <w:t>cond_A = np.linalg.cond(A)</w:t>
+      </w:r>
+    </w:p>
+    <w:p>
+      <w:r>
+        <w:t>print(f"\nCondition number kappa(A) = {cond_A:.4f}")</w:t>
+      </w:r>
+    </w:p>
+    <w:p>
+      <w:r>
+        <w:t>if cond_A &lt; 100:</w:t>
+      </w:r>
+    </w:p>
+    <w:p>
+      <w:r>
+        <w:t>    print("=&gt; Well-conditioned (kappa &lt; 100) - solution is numerically stable.")</w:t>
+      </w:r>
+    </w:p>
+    <w:p>
+      <w:r>
+        <w:t>elif cond_A &lt; 1000:</w:t>
+      </w:r>
+    </w:p>
+    <w:p>
+      <w:r>
+        <w:t>    print("=&gt; Moderately conditioned - small rounding errors may appear.")</w:t>
+      </w:r>
+    </w:p>
+    <w:p>
+      <w:r>
+        <w:t>else:</w:t>
+      </w:r>
+    </w:p>
+    <w:p>
+      <w:r>
+        <w:lastRenderedPageBreak/>
+        <w:t>    print("=&gt; Ill-conditioned (kappa &gt;= 1000) - solution may be sensitive to rounding.")</w:t>
+      </w:r>
+    </w:p>
+    <w:p/>
+    <w:p>
+      <w:r>
+        <w:t># ============================================================</w:t>
+      </w:r>
+    </w:p>
+    <w:p>
+      <w:r>
+        <w:t># 3. SOLVE THE SYSTEM</w:t>
+      </w:r>
+    </w:p>
+    <w:p>
+      <w:r>
+        <w:t># ============================================================</w:t>
+      </w:r>
+    </w:p>
+    <w:p/>
+    <w:p>
+      <w:r>
+        <w:t>print("\n" + "-" * 50)</w:t>
+      </w:r>
+    </w:p>
+    <w:p>
+      <w:r>
+        <w:t>print("SOLUTION")</w:t>
+      </w:r>
+    </w:p>
+    <w:p>
+      <w:r>
+        <w:t>print("-" * 50)</w:t>
+      </w:r>
+    </w:p>
+    <w:p/>
+    <w:p>
+      <w:r>
+        <w:t># 3a. Solve via numpy.linalg.solve (uses LAPACK - stable, efficient)</w:t>
+      </w:r>
+    </w:p>
+    <w:p>
+      <w:r>
+        <w:t>x = np.linalg.solve(A, b)</w:t>
+      </w:r>
+    </w:p>
+    <w:p/>
+    <w:p>
+      <w:r>
+        <w:t># Label the solutions</w:t>
+      </w:r>
+    </w:p>
+    <w:p>
+      <w:r>
+        <w:t>zone_labels = ['Zone 1', 'Zone 2', 'Zone 3', 'Zone 4']</w:t>
+      </w:r>
+    </w:p>
+    <w:p>
+      <w:r>
+        <w:t>print("\nEquilibrium daily demand per zone (x1..x4):")</w:t>
+      </w:r>
+    </w:p>
+    <w:p>
+      <w:r>
+        <w:t>for i, (label, val) in enumerate(zip(zone_labels, x), 1):</w:t>
+      </w:r>
+    </w:p>
+    <w:p>
+      <w:r>
+        <w:t>    print(f"  x{i} ({label}) = {val:.4f}  units/day")</w:t>
+      </w:r>
+    </w:p>
+    <w:p/>
+    <w:p>
+      <w:r>
+        <w:t># 3b. Verification - check that Ax is approx b</w:t>
+      </w:r>
+    </w:p>
+    <w:p>
+      <w:r>
+        <w:t>print("\nVerification (A @ x should equal b):")</w:t>
+      </w:r>
+    </w:p>
+    <w:p>
+      <w:r>
+        <w:t>print(f"  Residual (max error): {np.max(np.abs(A @ x - b)):.2e}")</w:t>
+      </w:r>
+    </w:p>
+    <w:p>
+      <w:r>
+        <w:t>print("  =&gt; Solution checks out (error approx machine precision).")</w:t>
+      </w:r>
+    </w:p>
+    <w:p/>
+    <w:p>
+      <w:r>
+        <w:t># ============================================================</w:t>
+      </w:r>
+    </w:p>
+    <w:p>
+      <w:r>
+        <w:lastRenderedPageBreak/>
+        <w:t># 4. INTERPRETATION</w:t>
+      </w:r>
+    </w:p>
+    <w:p>
+      <w:r>
+        <w:t># ============================================================</w:t>
+      </w:r>
+    </w:p>
+    <w:p/>
+    <w:p>
+      <w:r>
+        <w:t>print("\n" + "-" * 50)</w:t>
+      </w:r>
+    </w:p>
+    <w:p>
+      <w:r>
+        <w:t>print("INTERPRETATION")</w:t>
+      </w:r>
+    </w:p>
+    <w:p>
+      <w:r>
+        <w:t>print("-" * 50)</w:t>
+      </w:r>
+    </w:p>
+    <w:p>
+      <w:r>
+        <w:t>print(f"""</w:t>
+      </w:r>
+    </w:p>
+    <w:p>
+      <w:r>
+        <w:t>- All four zones have unique, stable equilibrium demands.</w:t>
+      </w:r>
+    </w:p>
+    <w:p>
+      <w:r>
+        <w:t>- Zone demands range from {x.min():.1f} to {x.max():.1f} units/day.</w:t>
+      </w:r>
+    </w:p>
+    <w:p>
+      <w:r>
+        <w:t>- The zone with highest demand: {zone_labels[np.argmax(x)]} ({x.max():.1f})</w:t>
+      </w:r>
+    </w:p>
+    <w:p>
+      <w:r>
+        <w:t>- The zone with lowest demand:  {zone_labels[np.argmin(x)]} ({x.min():.1f})</w:t>
+      </w:r>
+    </w:p>
+    <w:p>
+      <w:r>
+        <w:t>- A unique solution means planners can predict resource needs</w:t>
+      </w:r>
+    </w:p>
+    <w:p>
+      <w:r>
+        <w:t>  with certainty - the system converges to one fixed state.</w:t>
+      </w:r>
+    </w:p>
+    <w:p>
+      <w:r>
+        <w:t>""")</w:t>
+      </w:r>
+    </w:p>
+    <w:p/>
+    <w:p>
+      <w:r>
+        <w:t># ============================================================</w:t>
+      </w:r>
+    </w:p>
+    <w:p>
+      <w:r>
+        <w:t># 5. VISUALISATION - Seaborn bar chart</w:t>
+      </w:r>
+    </w:p>
+    <w:p>
+      <w:r>
+        <w:t># ============================================================</w:t>
+      </w:r>
+    </w:p>
+    <w:p/>
+    <w:p>
+      <w:r>
+        <w:t>print("-" * 50)</w:t>
+      </w:r>
+    </w:p>
+    <w:p>
+      <w:r>
+        <w:t>print("GENERATING FIGURE...")</w:t>
+      </w:r>
+    </w:p>
+    <w:p>
+      <w:r>
+        <w:t>print("-" * 50)</w:t>
+      </w:r>
+    </w:p>
+    <w:p/>
+    <w:p>
+      <w:r>
+        <w:t>sns.set_theme(style="whitegrid", palette="muted")</w:t>
+      </w:r>
+    </w:p>
+    <w:p/>
+    <w:p>
+      <w:r>
+        <w:lastRenderedPageBreak/>
+        <w:t>fig, ax = plt.subplots(figsize=(8, 5))</w:t>
+      </w:r>
+    </w:p>
+    <w:p/>
+    <w:p>
+      <w:r>
+        <w:t># Create the bar plot</w:t>
+      </w:r>
+    </w:p>
+    <w:p>
+      <w:r>
+        <w:t>bar_colors = sns.color_palette("muted", n_colors=4)</w:t>
+      </w:r>
+    </w:p>
+    <w:p>
+      <w:r>
+        <w:t>bars = ax.bar(zone_labels, x, color=bar_colors, edgecolor='black', linewidth=0.5)</w:t>
+      </w:r>
+    </w:p>
+    <w:p/>
+    <w:p>
+      <w:r>
+        <w:t># Add value labels on top of each bar</w:t>
+      </w:r>
+    </w:p>
+    <w:p>
+      <w:r>
+        <w:t>for bar, val in zip(bars, x):</w:t>
+      </w:r>
+    </w:p>
+    <w:p>
+      <w:r>
+        <w:t>    ax.text(bar.get_x() + bar.get_width()/2, bar.get_height() + 1,</w:t>
+      </w:r>
+    </w:p>
+    <w:p>
+      <w:r>
+        <w:t>            f'{val:.1f}', ha='center', va='bottom', fontsize=11, fontweight='bold')</w:t>
+      </w:r>
+    </w:p>
+    <w:p/>
+    <w:p>
+      <w:r>
+        <w:t># Labels and title</w:t>
+      </w:r>
+    </w:p>
+    <w:p>
+      <w:r>
+        <w:t>ax.set_xlabel('Urban Zone', fontsize=12)</w:t>
+      </w:r>
+    </w:p>
+    <w:p>
+      <w:r>
+        <w:t>ax.set_ylabel('Equilibrium Daily Demand (units)', fontsize=12)</w:t>
+      </w:r>
+    </w:p>
+    <w:p>
+      <w:r>
+        <w:t>ax.set_title('Steady-State Resource Demand by Urban Zone', fontsize=14, fontweight='bold')</w:t>
+      </w:r>
+    </w:p>
+    <w:p>
+      <w:r>
+        <w:t>ax.set_ylim(0, max(x) * 1.2)  # headroom for labels</w:t>
+      </w:r>
+    </w:p>
+    <w:p/>
+    <w:p>
+      <w:r>
+        <w:t># Add a horizontal reference line for the average</w:t>
+      </w:r>
+    </w:p>
+    <w:p>
+      <w:r>
+        <w:t>avg_demand = np.mean(x)</w:t>
+      </w:r>
+    </w:p>
+    <w:p>
+      <w:r>
+        <w:t>ax.axhline(avg_demand, color='gray', linestyle='--', linewidth=1, alpha=0.7,</w:t>
+      </w:r>
+    </w:p>
+    <w:p>
+      <w:r>
+        <w:t>           label=f'Average ({avg_demand:.1f})')</w:t>
+      </w:r>
+    </w:p>
+    <w:p>
+      <w:r>
+        <w:t>ax.legend(fontsize=10)</w:t>
+      </w:r>
+    </w:p>
+    <w:p/>
+    <w:p>
+      <w:r>
+        <w:t>plt.tight_layout()</w:t>
+      </w:r>
+    </w:p>
+    <w:p/>
+    <w:p>
+      <w:r>
+        <w:t># Save figure at &gt;=150 dpi as required</w:t>
+      </w:r>
+    </w:p>
+    <w:p>
+      <w:r>
+        <w:t>fig_path = 'figures/fig_task1_zone_demands.png'</w:t>
+      </w:r>
+    </w:p>
+    <w:p>
+      <w:r>
+        <w:t>plt.savefig(fig_path, dpi=150)</w:t>
+      </w:r>
+    </w:p>
+    <w:p>
+      <w:r>
+        <w:t>print(f"Figure saved to '{fig_path}'")</w:t>
+      </w:r>
+    </w:p>
+    <w:p/>
+    <w:p>
+      <w:r>
+        <w:t># Also show the print (will be visible when running)</w:t>
+      </w:r>
+    </w:p>
+    <w:p>
+      <w:r>
+        <w:t># plt.show()   # uncomment to display interactively</w:t>
+      </w:r>
+    </w:p>
+    <w:p/>
+    <w:p>
+      <w:r>
+        <w:t>print("\n" + "=" * 60)</w:t>
+      </w:r>
+    </w:p>
+    <w:p>
+      <w:r>
+        <w:t>print("TASK 1 COMPLETE")</w:t>
+      </w:r>
+    </w:p>
+    <w:p>
+      <w:r>
+        <w:t>print("=" * 60)</w:t>
+      </w:r>
+    </w:p>
+    <w:p/>
     <w:p>
       <w:pPr>
         <w:pStyle w:val="Heading2"/>
       </w:pPr>
-      <w:bookmarkStart w:id="26" w:name="_Toc234281168"/>
+      <w:bookmarkStart w:id="24" w:name="_Toc234281168"/>
       <w:r>
         <w:rPr>
           <w:rFonts w:ascii="Times New Roman" w:hAnsi="Times New Roman"/>
         </w:rPr>
         <w:t>Task 2: Calculus</w:t>
       </w:r>
-      <w:bookmarkEnd w:id="26"/>
+      <w:bookmarkEnd w:id="24"/>
+    </w:p>
+    <w:p>
+      <w:pPr>
+        <w:spacing w:after="0"/>
+        <w:ind w:left="283"/>
+      </w:pPr>
+      <w:r>
+        <w:t>"""</w:t>
+      </w:r>
+    </w:p>
+    <w:p>
+      <w:pPr>
+        <w:spacing w:after="0"/>
+        <w:ind w:left="283"/>
+      </w:pPr>
+      <w:r>
+        <w:t>Task 2 - Demand Over Time (Calculus)</w:t>
+      </w:r>
+    </w:p>
+    <w:p>
+      <w:pPr>
+        <w:spacing w:after="0"/>
+        <w:ind w:left="283"/>
+      </w:pPr>
+      <w:r>
+        <w:t>COM7023 Maths for Data Science - Urban Resource Intelligence</w:t>
+      </w:r>
+    </w:p>
+    <w:p>
+      <w:pPr>
+        <w:spacing w:after="0"/>
+        <w:ind w:left="283"/>
+      </w:pPr>
+    </w:p>
+    <w:p>
+      <w:pPr>
+        <w:spacing w:after="0"/>
+        <w:ind w:left="283"/>
+      </w:pPr>
+      <w:r>
+        <w:t>Analyse D(t) = 4t^3 - 18t^2 + 24t + 90, where t is in hours.</w:t>
+      </w:r>
+    </w:p>
+    <w:p>
+      <w:pPr>
+        <w:spacing w:after="0"/>
+        <w:ind w:left="283"/>
+      </w:pPr>
+      <w:r>
+        <w:t>- Find critical points (t=1, t=2) via D'(t) = 12t^2 - 36t + 24</w:t>
+      </w:r>
+    </w:p>
+    <w:p>
+      <w:pPr>
+        <w:spacing w:after="0"/>
+        <w:ind w:left="283"/>
+      </w:pPr>
+      <w:r>
+        <w:t>- Classify via D''(t) = 24t - 36: t=1 local max, t=2 local min, t=1.5 inflection</w:t>
+      </w:r>
+    </w:p>
+    <w:p>
+      <w:pPr>
+        <w:spacing w:after="0"/>
+        <w:ind w:left="283"/>
+      </w:pPr>
+      <w:r>
+        <w:t>- Interpret intervals of increase/decrease and peak-demand management.</w:t>
+      </w:r>
+    </w:p>
+    <w:p>
+      <w:pPr>
+        <w:spacing w:after="0"/>
+        <w:ind w:left="283"/>
+      </w:pPr>
+      <w:r>
+        <w:t>"""</w:t>
+      </w:r>
+    </w:p>
+    <w:p>
+      <w:pPr>
+        <w:spacing w:after="0"/>
+        <w:ind w:left="283"/>
+      </w:pPr>
+    </w:p>
+    <w:p>
+      <w:pPr>
+        <w:spacing w:after="0"/>
+        <w:ind w:left="283"/>
+      </w:pPr>
+      <w:r>
+        <w:t>import numpy as np</w:t>
+      </w:r>
+    </w:p>
+    <w:p>
+      <w:pPr>
+        <w:spacing w:after="0"/>
+        <w:ind w:left="283"/>
+      </w:pPr>
+      <w:r>
+        <w:t>import sympy as sp</w:t>
+      </w:r>
+    </w:p>
+    <w:p>
+      <w:pPr>
+        <w:spacing w:after="0"/>
+        <w:ind w:left="283"/>
+      </w:pPr>
+      <w:r>
+        <w:t>import seaborn as sns</w:t>
+      </w:r>
+    </w:p>
+    <w:p>
+      <w:pPr>
+        <w:spacing w:after="0"/>
+        <w:ind w:left="283"/>
+      </w:pPr>
+      <w:r>
+        <w:t>import matplotlib.pyplot as plt</w:t>
+      </w:r>
+    </w:p>
+    <w:p>
+      <w:pPr>
+        <w:spacing w:after="0"/>
+        <w:ind w:left="283"/>
+      </w:pPr>
+    </w:p>
+    <w:p>
+      <w:pPr>
+        <w:spacing w:after="0"/>
+        <w:ind w:left="283"/>
+      </w:pPr>
+      <w:r>
+        <w:t># ============================================================</w:t>
+      </w:r>
+    </w:p>
+    <w:p>
+      <w:pPr>
+        <w:spacing w:after="0"/>
+        <w:ind w:left="283"/>
+      </w:pPr>
+      <w:r>
+        <w:t># 1. DEFINE THE FUNCTION</w:t>
+      </w:r>
+    </w:p>
+    <w:p>
+      <w:pPr>
+        <w:spacing w:after="0"/>
+        <w:ind w:left="283"/>
+      </w:pPr>
+      <w:r>
+        <w:t># ============================================================</w:t>
+      </w:r>
+    </w:p>
+    <w:p>
+      <w:pPr>
+        <w:spacing w:after="0"/>
+        <w:ind w:left="283"/>
+      </w:pPr>
+    </w:p>
+    <w:p>
+      <w:pPr>
+        <w:spacing w:after="0"/>
+        <w:ind w:left="283"/>
+      </w:pPr>
+      <w:r>
+        <w:t># Symbolic definition for verification</w:t>
+      </w:r>
+    </w:p>
+    <w:p>
+      <w:pPr>
+        <w:spacing w:after="0"/>
+        <w:ind w:left="283"/>
+      </w:pPr>
+      <w:r>
+        <w:t>t_sym = sp.Symbol('t')</w:t>
+      </w:r>
+    </w:p>
+    <w:p>
+      <w:pPr>
+        <w:spacing w:after="0"/>
+        <w:ind w:left="283"/>
+      </w:pPr>
+      <w:r>
+        <w:t>D_sym = 4*t_sym**3 - 18*t_sym**2 + 24*t_sym + 90</w:t>
+      </w:r>
+    </w:p>
+    <w:p>
+      <w:pPr>
+        <w:spacing w:after="0"/>
+        <w:ind w:left="283"/>
+      </w:pPr>
+    </w:p>
+    <w:p>
+      <w:pPr>
+        <w:spacing w:after="0"/>
+        <w:ind w:left="283"/>
+      </w:pPr>
+      <w:r>
+        <w:t>print("=" * 60)</w:t>
+      </w:r>
+    </w:p>
+    <w:p>
+      <w:pPr>
+        <w:spacing w:after="0"/>
+        <w:ind w:left="283"/>
+      </w:pPr>
+      <w:r>
+        <w:t>print("TASK 2 - DEMAND OVER TIME (CALCULUS)")</w:t>
+      </w:r>
+    </w:p>
+    <w:p>
+      <w:pPr>
+        <w:spacing w:after="0"/>
+        <w:ind w:left="283"/>
+      </w:pPr>
+      <w:r>
+        <w:t>print("=" * 60)</w:t>
+      </w:r>
+    </w:p>
+    <w:p>
+      <w:pPr>
+        <w:spacing w:after="0"/>
+        <w:ind w:left="283"/>
+      </w:pPr>
+      <w:r>
+        <w:t>print(f"\nDemand function: D(t) = 4t^3 - 18t^2 + 24t + 90")</w:t>
+      </w:r>
+    </w:p>
+    <w:p>
+      <w:pPr>
+        <w:spacing w:after="0"/>
+        <w:ind w:left="283"/>
+      </w:pPr>
+      <w:r>
+        <w:t>print(f"Domain: t &gt;= 0 (t in hours)")</w:t>
+      </w:r>
+    </w:p>
+    <w:p>
+      <w:pPr>
+        <w:spacing w:after="0"/>
+        <w:ind w:left="283"/>
+      </w:pPr>
+    </w:p>
+    <w:p>
+      <w:pPr>
+        <w:spacing w:after="0"/>
+        <w:ind w:left="283"/>
+      </w:pPr>
+      <w:r>
+        <w:t># ============================================================</w:t>
+      </w:r>
+    </w:p>
+    <w:p>
+      <w:pPr>
+        <w:spacing w:after="0"/>
+        <w:ind w:left="283"/>
+      </w:pPr>
+      <w:r>
+        <w:t># 2. DERIVATIVES</w:t>
+      </w:r>
+    </w:p>
+    <w:p>
+      <w:pPr>
+        <w:spacing w:after="0"/>
+        <w:ind w:left="283"/>
+      </w:pPr>
+      <w:r>
+        <w:t># ============================================================</w:t>
+      </w:r>
+    </w:p>
+    <w:p>
+      <w:pPr>
+        <w:spacing w:after="0"/>
+        <w:ind w:left="283"/>
+      </w:pPr>
+    </w:p>
+    <w:p>
+      <w:pPr>
+        <w:spacing w:after="0"/>
+        <w:ind w:left="283"/>
+      </w:pPr>
+      <w:r>
+        <w:t>print("\n" + "-" * 50)</w:t>
+      </w:r>
+    </w:p>
+    <w:p>
+      <w:pPr>
+        <w:spacing w:after="0"/>
+        <w:ind w:left="283"/>
+      </w:pPr>
+      <w:r>
+        <w:t>print("DERIVATIVES")</w:t>
+      </w:r>
+    </w:p>
+    <w:p>
+      <w:pPr>
+        <w:spacing w:after="0"/>
+        <w:ind w:left="283"/>
+      </w:pPr>
+      <w:r>
+        <w:t>print("-" * 50)</w:t>
+      </w:r>
+    </w:p>
+    <w:p>
+      <w:pPr>
+        <w:spacing w:after="0"/>
+        <w:ind w:left="283"/>
+      </w:pPr>
+    </w:p>
+    <w:p>
+      <w:pPr>
+        <w:spacing w:after="0"/>
+        <w:ind w:left="283"/>
+      </w:pPr>
+      <w:r>
+        <w:t># First derivative (symbolic)</w:t>
+      </w:r>
+    </w:p>
+    <w:p>
+      <w:pPr>
+        <w:spacing w:after="0"/>
+        <w:ind w:left="283"/>
+      </w:pPr>
+      <w:r>
+        <w:t>D_prime_sym = sp.diff(D_sym, t_sym)</w:t>
+      </w:r>
+    </w:p>
+    <w:p>
+      <w:pPr>
+        <w:spacing w:after="0"/>
+        <w:ind w:left="283"/>
+      </w:pPr>
+      <w:r>
+        <w:t>print(f"\nD'(t) = {D_prime_sym}")</w:t>
+      </w:r>
+    </w:p>
+    <w:p>
+      <w:pPr>
+        <w:spacing w:after="0"/>
+        <w:ind w:left="283"/>
+      </w:pPr>
+      <w:r>
+        <w:t>print("  = 12t^2 - 36t + 24")</w:t>
+      </w:r>
+    </w:p>
+    <w:p>
+      <w:pPr>
+        <w:spacing w:after="0"/>
+        <w:ind w:left="283"/>
+      </w:pPr>
+    </w:p>
+    <w:p>
+      <w:pPr>
+        <w:spacing w:after="0"/>
+        <w:ind w:left="283"/>
+      </w:pPr>
+      <w:r>
+        <w:t># Second derivative (symbolic)</w:t>
+      </w:r>
+    </w:p>
+    <w:p>
+      <w:pPr>
+        <w:spacing w:after="0"/>
+        <w:ind w:left="283"/>
+      </w:pPr>
+      <w:r>
+        <w:t>D_double_sym = sp.diff(D_prime_sym, t_sym)</w:t>
+      </w:r>
+    </w:p>
+    <w:p>
+      <w:pPr>
+        <w:spacing w:after="0"/>
+        <w:ind w:left="283"/>
+      </w:pPr>
+      <w:r>
+        <w:t>print(f"\nD''(t) = {D_double_sym}")</w:t>
+      </w:r>
+    </w:p>
+    <w:p>
+      <w:pPr>
+        <w:spacing w:after="0"/>
+        <w:ind w:left="283"/>
+      </w:pPr>
+      <w:r>
+        <w:t>print("  = 24t - 36")</w:t>
+      </w:r>
+    </w:p>
+    <w:p>
+      <w:pPr>
+        <w:spacing w:after="0"/>
+        <w:ind w:left="283"/>
+      </w:pPr>
+    </w:p>
+    <w:p>
+      <w:pPr>
+        <w:spacing w:after="0"/>
+        <w:ind w:left="283"/>
+      </w:pPr>
+      <w:r>
+        <w:t># Numerical evaluation</w:t>
+      </w:r>
+    </w:p>
+    <w:p>
+      <w:pPr>
+        <w:spacing w:after="0"/>
+        <w:ind w:left="283"/>
+      </w:pPr>
+      <w:r>
+        <w:t>print("\nEvaluating at key time points:")</w:t>
+      </w:r>
+    </w:p>
+    <w:p>
+      <w:pPr>
+        <w:spacing w:after="0"/>
+        <w:ind w:left="283"/>
+      </w:pPr>
+      <w:r>
+        <w:t>t_vals = [0, 0.5, 1, 1.5, 2, 2.5, 3, 4]</w:t>
+      </w:r>
+    </w:p>
+    <w:p>
+      <w:pPr>
+        <w:spacing w:after="0"/>
+        <w:ind w:left="283"/>
+      </w:pPr>
+      <w:r>
+        <w:t>for t in t_vals:</w:t>
+      </w:r>
+    </w:p>
+    <w:p>
+      <w:pPr>
+        <w:spacing w:after="0"/>
+        <w:ind w:left="283"/>
+      </w:pPr>
+      <w:r>
+        <w:t>    D_val = 4*t**3 - 18*t**2 + 24*t + 90</w:t>
+      </w:r>
+    </w:p>
+    <w:p>
+      <w:pPr>
+        <w:spacing w:after="0"/>
+        <w:ind w:left="283"/>
+      </w:pPr>
+      <w:r>
+        <w:t>    Dp_val = 12*t**2 - 36*t + 24</w:t>
+      </w:r>
+    </w:p>
+    <w:p>
+      <w:pPr>
+        <w:spacing w:after="0"/>
+        <w:ind w:left="283"/>
+      </w:pPr>
+      <w:r>
+        <w:t>    Dpp_val = 24*t - 36</w:t>
+      </w:r>
+    </w:p>
+    <w:p>
+      <w:pPr>
+        <w:spacing w:after="0"/>
+        <w:ind w:left="283"/>
+      </w:pPr>
+      <w:r>
+        <w:t>    print(f"  t={t:.1f}: D={D_val:.2f}, D'={Dp_val:.2f}, D''={Dpp_val:.2f}")</w:t>
+      </w:r>
+    </w:p>
+    <w:p>
+      <w:pPr>
+        <w:spacing w:after="0"/>
+        <w:ind w:left="283"/>
+      </w:pPr>
+    </w:p>
+    <w:p>
+      <w:pPr>
+        <w:spacing w:after="0"/>
+        <w:ind w:left="283"/>
+      </w:pPr>
+      <w:r>
+        <w:t># ============================================================</w:t>
+      </w:r>
+    </w:p>
+    <w:p>
+      <w:pPr>
+        <w:spacing w:after="0"/>
+        <w:ind w:left="283"/>
+      </w:pPr>
+      <w:r>
+        <w:t># 3. CRITICAL POINTS</w:t>
+      </w:r>
+    </w:p>
+    <w:p>
+      <w:pPr>
+        <w:spacing w:after="0"/>
+        <w:ind w:left="283"/>
+      </w:pPr>
+      <w:r>
+        <w:lastRenderedPageBreak/>
+        <w:t># ============================================================</w:t>
+      </w:r>
+    </w:p>
+    <w:p>
+      <w:pPr>
+        <w:spacing w:after="0"/>
+        <w:ind w:left="283"/>
+      </w:pPr>
+    </w:p>
+    <w:p>
+      <w:pPr>
+        <w:spacing w:after="0"/>
+        <w:ind w:left="283"/>
+      </w:pPr>
+      <w:r>
+        <w:t>print("\n" + "-" * 50)</w:t>
+      </w:r>
+    </w:p>
+    <w:p>
+      <w:pPr>
+        <w:spacing w:after="0"/>
+        <w:ind w:left="283"/>
+      </w:pPr>
+      <w:r>
+        <w:t>print("CRITICAL POINTS")</w:t>
+      </w:r>
+    </w:p>
+    <w:p>
+      <w:pPr>
+        <w:spacing w:after="0"/>
+        <w:ind w:left="283"/>
+      </w:pPr>
+      <w:r>
+        <w:t>print("-" * 50)</w:t>
+      </w:r>
+    </w:p>
+    <w:p>
+      <w:pPr>
+        <w:spacing w:after="0"/>
+        <w:ind w:left="283"/>
+      </w:pPr>
+    </w:p>
+    <w:p>
+      <w:pPr>
+        <w:spacing w:after="0"/>
+        <w:ind w:left="283"/>
+      </w:pPr>
+      <w:r>
+        <w:t># Set D'(t) = 0 -&gt; 12t^2 - 36t + 24 = 0 -&gt; divide by 12: t^2 - 3t + 2 = 0</w:t>
+      </w:r>
+    </w:p>
+    <w:p>
+      <w:pPr>
+        <w:spacing w:after="0"/>
+        <w:ind w:left="283"/>
+      </w:pPr>
+      <w:r>
+        <w:t># Factor: (t-1)(t-2) = 0</w:t>
+      </w:r>
+    </w:p>
+    <w:p>
+      <w:pPr>
+        <w:spacing w:after="0"/>
+        <w:ind w:left="283"/>
+      </w:pPr>
+      <w:r>
+        <w:t>critical_points = [1, 2]</w:t>
+      </w:r>
+    </w:p>
+    <w:p>
+      <w:pPr>
+        <w:spacing w:after="0"/>
+        <w:ind w:left="283"/>
+      </w:pPr>
+    </w:p>
+    <w:p>
+      <w:pPr>
+        <w:spacing w:after="0"/>
+        <w:ind w:left="283"/>
+      </w:pPr>
+      <w:r>
+        <w:t>print(f"\nSetting D'(t) = 0:")</w:t>
+      </w:r>
+    </w:p>
+    <w:p>
+      <w:pPr>
+        <w:spacing w:after="0"/>
+        <w:ind w:left="283"/>
+      </w:pPr>
+      <w:r>
+        <w:t>print(f"  12t^2 - 36t + 24 = 0")</w:t>
+      </w:r>
+    </w:p>
+    <w:p>
+      <w:pPr>
+        <w:spacing w:after="0"/>
+        <w:ind w:left="283"/>
+      </w:pPr>
+      <w:r>
+        <w:t>print(f"  Divide by 12: t^2 - 3t + 2 = 0")</w:t>
+      </w:r>
+    </w:p>
+    <w:p>
+      <w:pPr>
+        <w:spacing w:after="0"/>
+        <w:ind w:left="283"/>
+      </w:pPr>
+      <w:r>
+        <w:t>print(f"  Factor: (t-1)(t-2) = 0")</w:t>
+      </w:r>
+    </w:p>
+    <w:p>
+      <w:pPr>
+        <w:spacing w:after="0"/>
+        <w:ind w:left="283"/>
+      </w:pPr>
+      <w:r>
+        <w:t>print(f"  Critical points: t = {critical_points[0]}, t = {critical_points[1]}")</w:t>
+      </w:r>
+    </w:p>
+    <w:p>
+      <w:pPr>
+        <w:spacing w:after="0"/>
+        <w:ind w:left="283"/>
+      </w:pPr>
+    </w:p>
+    <w:p>
+      <w:pPr>
+        <w:spacing w:after="0"/>
+        <w:ind w:left="283"/>
+      </w:pPr>
+      <w:r>
+        <w:t># Classify using second derivative test</w:t>
+      </w:r>
+    </w:p>
+    <w:p>
+      <w:pPr>
+        <w:spacing w:after="0"/>
+        <w:ind w:left="283"/>
+      </w:pPr>
+      <w:r>
+        <w:t>print("\nClassification using D''(t):")</w:t>
+      </w:r>
+    </w:p>
+    <w:p>
+      <w:pPr>
+        <w:spacing w:after="0"/>
+        <w:ind w:left="283"/>
+      </w:pPr>
+      <w:r>
+        <w:t>for t in critical_points:</w:t>
+      </w:r>
+    </w:p>
+    <w:p>
+      <w:pPr>
+        <w:spacing w:after="0"/>
+        <w:ind w:left="283"/>
+      </w:pPr>
+      <w:r>
+        <w:t>    Dpp = 24*t - 36</w:t>
+      </w:r>
+    </w:p>
+    <w:p>
+      <w:pPr>
+        <w:spacing w:after="0"/>
+        <w:ind w:left="283"/>
+      </w:pPr>
+      <w:r>
+        <w:t>    D_val = 4*t**3 - 18*t**2 + 24*t + 90</w:t>
+      </w:r>
+    </w:p>
+    <w:p>
+      <w:pPr>
+        <w:spacing w:after="0"/>
+        <w:ind w:left="283"/>
+      </w:pPr>
+      <w:r>
+        <w:t>    if Dpp &gt; 0:</w:t>
+      </w:r>
+    </w:p>
+    <w:p>
+      <w:pPr>
+        <w:spacing w:after="0"/>
+        <w:ind w:left="283"/>
+      </w:pPr>
+      <w:r>
+        <w:t>        classification = "LOCAL MINIMUM (D'' &gt; 0)"</w:t>
+      </w:r>
+    </w:p>
+    <w:p>
+      <w:pPr>
+        <w:spacing w:after="0"/>
+        <w:ind w:left="283"/>
+      </w:pPr>
+      <w:r>
+        <w:t>    elif Dpp &lt; 0:</w:t>
+      </w:r>
+    </w:p>
+    <w:p>
+      <w:pPr>
+        <w:spacing w:after="0"/>
+        <w:ind w:left="283"/>
+      </w:pPr>
+      <w:r>
+        <w:t>        classification = "LOCAL MAXIMUM (D'' &lt; 0)"</w:t>
+      </w:r>
+    </w:p>
+    <w:p>
+      <w:pPr>
+        <w:spacing w:after="0"/>
+        <w:ind w:left="283"/>
+      </w:pPr>
+      <w:r>
+        <w:t>    else:</w:t>
+      </w:r>
+    </w:p>
+    <w:p>
+      <w:pPr>
+        <w:spacing w:after="0"/>
+        <w:ind w:left="283"/>
+      </w:pPr>
+      <w:r>
+        <w:t>        classification = "Inflection point (D'' = 0)"</w:t>
+      </w:r>
+    </w:p>
+    <w:p>
+      <w:pPr>
+        <w:spacing w:after="0"/>
+        <w:ind w:left="283"/>
+      </w:pPr>
+      <w:r>
+        <w:t>    print(f"  t = {t}: D''({t}) = {Dpp:.0f} -&gt; {classification}")</w:t>
+      </w:r>
+    </w:p>
+    <w:p>
+      <w:pPr>
+        <w:spacing w:after="0"/>
+        <w:ind w:left="283"/>
+      </w:pPr>
+      <w:r>
+        <w:t>    print(f"     D({t}) = {D_val:.2f}")</w:t>
+      </w:r>
+    </w:p>
+    <w:p>
+      <w:pPr>
+        <w:spacing w:after="0"/>
+        <w:ind w:left="283"/>
+      </w:pPr>
+    </w:p>
+    <w:p>
+      <w:pPr>
+        <w:spacing w:after="0"/>
+        <w:ind w:left="283"/>
+      </w:pPr>
+      <w:r>
+        <w:t># ============================================================</w:t>
+      </w:r>
+    </w:p>
+    <w:p>
+      <w:pPr>
+        <w:spacing w:after="0"/>
+        <w:ind w:left="283"/>
+      </w:pPr>
+      <w:r>
+        <w:t># 4. INFLECTION POINT</w:t>
+      </w:r>
+    </w:p>
+    <w:p>
+      <w:pPr>
+        <w:spacing w:after="0"/>
+        <w:ind w:left="283"/>
+      </w:pPr>
+      <w:r>
+        <w:t># ============================================================</w:t>
+      </w:r>
+    </w:p>
+    <w:p>
+      <w:pPr>
+        <w:spacing w:after="0"/>
+        <w:ind w:left="283"/>
+      </w:pPr>
+    </w:p>
+    <w:p>
+      <w:pPr>
+        <w:spacing w:after="0"/>
+        <w:ind w:left="283"/>
+      </w:pPr>
+      <w:r>
+        <w:t>print("\n" + "-" * 50)</w:t>
+      </w:r>
+    </w:p>
+    <w:p>
+      <w:pPr>
+        <w:spacing w:after="0"/>
+        <w:ind w:left="283"/>
+      </w:pPr>
+      <w:r>
+        <w:t>print("INFLECTION POINT")</w:t>
+      </w:r>
+    </w:p>
+    <w:p>
+      <w:pPr>
+        <w:spacing w:after="0"/>
+        <w:ind w:left="283"/>
+      </w:pPr>
+      <w:r>
+        <w:t>print("-" * 50)</w:t>
+      </w:r>
+    </w:p>
+    <w:p>
+      <w:pPr>
+        <w:spacing w:after="0"/>
+        <w:ind w:left="283"/>
+      </w:pPr>
+    </w:p>
+    <w:p>
+      <w:pPr>
+        <w:spacing w:after="0"/>
+        <w:ind w:left="283"/>
+      </w:pPr>
+      <w:r>
+        <w:t># Set D''(t) = 0 -&gt; 24t - 36 = 0 -&gt; t = 1.5</w:t>
+      </w:r>
+    </w:p>
+    <w:p>
+      <w:pPr>
+        <w:spacing w:after="0"/>
+        <w:ind w:left="283"/>
+      </w:pPr>
+      <w:r>
+        <w:t>t_inflect = 36 / 24</w:t>
+      </w:r>
+    </w:p>
+    <w:p>
+      <w:pPr>
+        <w:spacing w:after="0"/>
+        <w:ind w:left="283"/>
+      </w:pPr>
+      <w:r>
+        <w:lastRenderedPageBreak/>
+        <w:t>D_inflect = 4*t_inflect**3 - 18*t_inflect**2 + 24*t_inflect + 90</w:t>
+      </w:r>
+    </w:p>
+    <w:p>
+      <w:pPr>
+        <w:spacing w:after="0"/>
+        <w:ind w:left="283"/>
+      </w:pPr>
+      <w:r>
+        <w:t>print(f"\nSetting D''(t) = 0:")</w:t>
+      </w:r>
+    </w:p>
+    <w:p>
+      <w:pPr>
+        <w:spacing w:after="0"/>
+        <w:ind w:left="283"/>
+      </w:pPr>
+      <w:r>
+        <w:t>print(f"  24t - 36 = 0")</w:t>
+      </w:r>
+    </w:p>
+    <w:p>
+      <w:pPr>
+        <w:spacing w:after="0"/>
+        <w:ind w:left="283"/>
+      </w:pPr>
+      <w:r>
+        <w:t>print(f"  t = {t_inflect}")</w:t>
+      </w:r>
+    </w:p>
+    <w:p>
+      <w:pPr>
+        <w:spacing w:after="0"/>
+        <w:ind w:left="283"/>
+      </w:pPr>
+      <w:r>
+        <w:t>print(f"  D({t_inflect}) = {D_inflect:.2f}")</w:t>
+      </w:r>
+    </w:p>
+    <w:p>
+      <w:pPr>
+        <w:spacing w:after="0"/>
+        <w:ind w:left="283"/>
+      </w:pPr>
+      <w:r>
+        <w:t>print(f"  At t = {t_inflect}, the rate of change switches from")</w:t>
+      </w:r>
+    </w:p>
+    <w:p>
+      <w:pPr>
+        <w:spacing w:after="0"/>
+        <w:ind w:left="283"/>
+      </w:pPr>
+      <w:r>
+        <w:t>print(f"  decreasing to increasing (concavity changes).")</w:t>
+      </w:r>
+    </w:p>
+    <w:p>
+      <w:pPr>
+        <w:spacing w:after="0"/>
+        <w:ind w:left="283"/>
+      </w:pPr>
+    </w:p>
+    <w:p>
+      <w:pPr>
+        <w:spacing w:after="0"/>
+        <w:ind w:left="283"/>
+      </w:pPr>
+      <w:r>
+        <w:t># ============================================================</w:t>
+      </w:r>
+    </w:p>
+    <w:p>
+      <w:pPr>
+        <w:spacing w:after="0"/>
+        <w:ind w:left="283"/>
+      </w:pPr>
+      <w:r>
+        <w:t># 5. INTERVALS OF INCREASE / DECREASE</w:t>
+      </w:r>
+    </w:p>
+    <w:p>
+      <w:pPr>
+        <w:spacing w:after="0"/>
+        <w:ind w:left="283"/>
+      </w:pPr>
+      <w:r>
+        <w:t># ============================================================</w:t>
+      </w:r>
+    </w:p>
+    <w:p>
+      <w:pPr>
+        <w:spacing w:after="0"/>
+        <w:ind w:left="283"/>
+      </w:pPr>
+    </w:p>
+    <w:p>
+      <w:pPr>
+        <w:spacing w:after="0"/>
+        <w:ind w:left="283"/>
+      </w:pPr>
+      <w:r>
+        <w:t>print("\n" + "-" * 50)</w:t>
+      </w:r>
+    </w:p>
+    <w:p>
+      <w:pPr>
+        <w:spacing w:after="0"/>
+        <w:ind w:left="283"/>
+      </w:pPr>
+      <w:r>
+        <w:t>print("INTERVALS OF INCREASE / DECREASE")</w:t>
+      </w:r>
+    </w:p>
+    <w:p>
+      <w:pPr>
+        <w:spacing w:after="0"/>
+        <w:ind w:left="283"/>
+      </w:pPr>
+      <w:r>
+        <w:t>print("-" * 50)</w:t>
+      </w:r>
+    </w:p>
+    <w:p>
+      <w:pPr>
+        <w:spacing w:after="0"/>
+        <w:ind w:left="283"/>
+      </w:pPr>
+      <w:r>
+        <w:t>print("""</w:t>
+      </w:r>
+    </w:p>
+    <w:p>
+      <w:pPr>
+        <w:spacing w:after="0"/>
+        <w:ind w:left="283"/>
+      </w:pPr>
+      <w:r>
+        <w:t>  Interval          D'(t) sign    Behaviour</w:t>
+      </w:r>
+    </w:p>
+    <w:p>
+      <w:pPr>
+        <w:spacing w:after="0"/>
+        <w:ind w:left="283"/>
+      </w:pPr>
+      <w:r>
+        <w:t>  ----------        ----------    ---------</w:t>
+      </w:r>
+    </w:p>
+    <w:p>
+      <w:pPr>
+        <w:spacing w:after="0"/>
+        <w:ind w:left="283"/>
+      </w:pPr>
+      <w:r>
+        <w:t>  t &lt; 1             positive (+)  D is INCREASING (ramp-up)</w:t>
+      </w:r>
+    </w:p>
+    <w:p>
+      <w:pPr>
+        <w:spacing w:after="0"/>
+        <w:ind w:left="283"/>
+      </w:pPr>
+      <w:r>
+        <w:t>  1 &lt; t &lt; 2         negative (-)  D is DECREASING (mid-period dip)</w:t>
+      </w:r>
+    </w:p>
+    <w:p>
+      <w:pPr>
+        <w:spacing w:after="0"/>
+        <w:ind w:left="283"/>
+      </w:pPr>
+      <w:r>
+        <w:t>  t &gt; 2             positive (+)  D is INCREASING (renewed growth)</w:t>
+      </w:r>
+    </w:p>
+    <w:p>
+      <w:pPr>
+        <w:spacing w:after="0"/>
+        <w:ind w:left="283"/>
+      </w:pPr>
+      <w:r>
+        <w:t>""")</w:t>
+      </w:r>
+    </w:p>
+    <w:p>
+      <w:pPr>
+        <w:spacing w:after="0"/>
+        <w:ind w:left="283"/>
+      </w:pPr>
+    </w:p>
+    <w:p>
+      <w:pPr>
+        <w:spacing w:after="0"/>
+        <w:ind w:left="283"/>
+      </w:pPr>
+      <w:r>
+        <w:t># ============================================================</w:t>
+      </w:r>
+    </w:p>
+    <w:p>
+      <w:pPr>
+        <w:spacing w:after="0"/>
+        <w:ind w:left="283"/>
+      </w:pPr>
+      <w:r>
+        <w:t># 6. INTERPRETATION</w:t>
+      </w:r>
+    </w:p>
+    <w:p>
+      <w:pPr>
+        <w:spacing w:after="0"/>
+        <w:ind w:left="283"/>
+      </w:pPr>
+      <w:r>
+        <w:t># ============================================================</w:t>
+      </w:r>
+    </w:p>
+    <w:p>
+      <w:pPr>
+        <w:spacing w:after="0"/>
+        <w:ind w:left="283"/>
+      </w:pPr>
+    </w:p>
+    <w:p>
+      <w:pPr>
+        <w:spacing w:after="0"/>
+        <w:ind w:left="283"/>
+      </w:pPr>
+      <w:r>
+        <w:t>print("-" * 50)</w:t>
+      </w:r>
+    </w:p>
+    <w:p>
+      <w:pPr>
+        <w:spacing w:after="0"/>
+        <w:ind w:left="283"/>
+      </w:pPr>
+      <w:r>
+        <w:t>print("INTERPRETATION")</w:t>
+      </w:r>
+    </w:p>
+    <w:p>
+      <w:pPr>
+        <w:spacing w:after="0"/>
+        <w:ind w:left="283"/>
+      </w:pPr>
+      <w:r>
+        <w:t>print("-" * 50)</w:t>
+      </w:r>
+    </w:p>
+    <w:p>
+      <w:pPr>
+        <w:spacing w:after="0"/>
+        <w:ind w:left="283"/>
+      </w:pPr>
+      <w:r>
+        <w:t>print("""</w:t>
+      </w:r>
+    </w:p>
+    <w:p>
+      <w:pPr>
+        <w:spacing w:after="0"/>
+        <w:ind w:left="283"/>
+      </w:pPr>
+      <w:r>
+        <w:t>- Demand starts at D(0) = 90, rises to a peak at t=1 hour (D=100),</w:t>
+      </w:r>
+    </w:p>
+    <w:p>
+      <w:pPr>
+        <w:spacing w:after="0"/>
+        <w:ind w:left="283"/>
+      </w:pPr>
+      <w:r>
+        <w:t>  then dips to a trough at t=2 hours (D=98), before rising again.</w:t>
+      </w:r>
+    </w:p>
+    <w:p>
+      <w:pPr>
+        <w:spacing w:after="0"/>
+        <w:ind w:left="283"/>
+      </w:pPr>
+      <w:r>
+        <w:t>- The local maximum at t=1 represents a morning peak-demand period.</w:t>
+      </w:r>
+    </w:p>
+    <w:p>
+      <w:pPr>
+        <w:spacing w:after="0"/>
+        <w:ind w:left="283"/>
+      </w:pPr>
+      <w:r>
+        <w:t>- The local minimum at t=2 represents a midday lull, useful for</w:t>
+      </w:r>
+    </w:p>
+    <w:p>
+      <w:pPr>
+        <w:spacing w:after="0"/>
+        <w:ind w:left="283"/>
+      </w:pPr>
+      <w:r>
+        <w:t>  scheduling maintenance or storage.</w:t>
+      </w:r>
+    </w:p>
+    <w:p>
+      <w:pPr>
+        <w:spacing w:after="0"/>
+        <w:ind w:left="283"/>
+      </w:pPr>
+      <w:r>
+        <w:t>- After t=2, demand rises again (afternoon/evening ramp-up).</w:t>
+      </w:r>
+    </w:p>
+    <w:p>
+      <w:pPr>
+        <w:spacing w:after="0"/>
+        <w:ind w:left="283"/>
+      </w:pPr>
+      <w:r>
+        <w:t>- The inflection point at t=1.5 is where the rate of decrease</w:t>
+      </w:r>
+    </w:p>
+    <w:p>
+      <w:pPr>
+        <w:spacing w:after="0"/>
+        <w:ind w:left="283"/>
+      </w:pPr>
+      <w:r>
+        <w:t>  itself starts to slow down, signalling recovery before the</w:t>
+      </w:r>
+    </w:p>
+    <w:p>
+      <w:pPr>
+        <w:spacing w:after="0"/>
+        <w:ind w:left="283"/>
+      </w:pPr>
+      <w:r>
+        <w:t>  actual upturn at t=2.</w:t>
+      </w:r>
+    </w:p>
+    <w:p>
+      <w:pPr>
+        <w:spacing w:after="0"/>
+        <w:ind w:left="283"/>
+      </w:pPr>
+      <w:r>
+        <w:lastRenderedPageBreak/>
+        <w:t>- For planners: schedule system maintenance during the dip</w:t>
+      </w:r>
+    </w:p>
+    <w:p>
+      <w:pPr>
+        <w:spacing w:after="0"/>
+        <w:ind w:left="283"/>
+      </w:pPr>
+      <w:r>
+        <w:t>  (1-2 hours); prepare for peak at t=1 and sustained rise</w:t>
+      </w:r>
+    </w:p>
+    <w:p>
+      <w:pPr>
+        <w:spacing w:after="0"/>
+        <w:ind w:left="283"/>
+      </w:pPr>
+      <w:r>
+        <w:t>  after t=2.</w:t>
+      </w:r>
+    </w:p>
+    <w:p>
+      <w:pPr>
+        <w:spacing w:after="0"/>
+        <w:ind w:left="283"/>
+      </w:pPr>
+      <w:r>
+        <w:t>""")</w:t>
+      </w:r>
+    </w:p>
+    <w:p>
+      <w:pPr>
+        <w:spacing w:after="0"/>
+        <w:ind w:left="283"/>
+      </w:pPr>
+    </w:p>
+    <w:p>
+      <w:pPr>
+        <w:spacing w:after="0"/>
+        <w:ind w:left="283"/>
+      </w:pPr>
+      <w:r>
+        <w:t># ============================================================</w:t>
+      </w:r>
+    </w:p>
+    <w:p>
+      <w:pPr>
+        <w:spacing w:after="0"/>
+        <w:ind w:left="283"/>
+      </w:pPr>
+      <w:r>
+        <w:t># 7. VISUALISATION - D(t) curve with critical points</w:t>
+      </w:r>
+    </w:p>
+    <w:p>
+      <w:pPr>
+        <w:spacing w:after="0"/>
+        <w:ind w:left="283"/>
+      </w:pPr>
+      <w:r>
+        <w:t># ============================================================</w:t>
+      </w:r>
+    </w:p>
+    <w:p>
+      <w:pPr>
+        <w:spacing w:after="0"/>
+        <w:ind w:left="283"/>
+      </w:pPr>
+    </w:p>
+    <w:p>
+      <w:pPr>
+        <w:spacing w:after="0"/>
+        <w:ind w:left="283"/>
+      </w:pPr>
+      <w:r>
+        <w:t>print("-" * 50)</w:t>
+      </w:r>
+    </w:p>
+    <w:p>
+      <w:pPr>
+        <w:spacing w:after="0"/>
+        <w:ind w:left="283"/>
+      </w:pPr>
+      <w:r>
+        <w:t>print("GENERATING FIGURE...")</w:t>
+      </w:r>
+    </w:p>
+    <w:p>
+      <w:pPr>
+        <w:spacing w:after="0"/>
+        <w:ind w:left="283"/>
+      </w:pPr>
+      <w:r>
+        <w:t>print("-" * 50)</w:t>
+      </w:r>
+    </w:p>
+    <w:p>
+      <w:pPr>
+        <w:spacing w:after="0"/>
+        <w:ind w:left="283"/>
+      </w:pPr>
+    </w:p>
+    <w:p>
+      <w:pPr>
+        <w:spacing w:after="0"/>
+        <w:ind w:left="283"/>
+      </w:pPr>
+      <w:r>
+        <w:t>sns.set_theme(style="whitegrid", palette="muted")</w:t>
+      </w:r>
+    </w:p>
+    <w:p>
+      <w:pPr>
+        <w:spacing w:after="0"/>
+        <w:ind w:left="283"/>
+      </w:pPr>
+    </w:p>
+    <w:p>
+      <w:pPr>
+        <w:spacing w:after="0"/>
+        <w:ind w:left="283"/>
+      </w:pPr>
+      <w:r>
+        <w:t># Create a figure with two subplots (D(t) on top, D'(t) on bottom)</w:t>
+      </w:r>
+    </w:p>
+    <w:p>
+      <w:pPr>
+        <w:spacing w:after="0"/>
+        <w:ind w:left="283"/>
+      </w:pPr>
+      <w:r>
+        <w:t>fig, (ax1, ax2) = plt.subplots(2, 1, figsize=(9, 7), sharex=True)</w:t>
+      </w:r>
+    </w:p>
+    <w:p>
+      <w:pPr>
+        <w:spacing w:after="0"/>
+        <w:ind w:left="283"/>
+      </w:pPr>
+    </w:p>
+    <w:p>
+      <w:pPr>
+        <w:spacing w:after="0"/>
+        <w:ind w:left="283"/>
+      </w:pPr>
+      <w:r>
+        <w:t># --- Time range ---</w:t>
+      </w:r>
+    </w:p>
+    <w:p>
+      <w:pPr>
+        <w:spacing w:after="0"/>
+        <w:ind w:left="283"/>
+      </w:pPr>
+      <w:r>
+        <w:t>t_plot = np.linspace(0, 4, 200)</w:t>
+      </w:r>
+    </w:p>
+    <w:p>
+      <w:pPr>
+        <w:spacing w:after="0"/>
+        <w:ind w:left="283"/>
+      </w:pPr>
+      <w:r>
+        <w:t>D_plot = 4*t_plot**3 - 18*t_plot**2 + 24*t_plot + 90</w:t>
+      </w:r>
+    </w:p>
+    <w:p>
+      <w:pPr>
+        <w:spacing w:after="0"/>
+        <w:ind w:left="283"/>
+      </w:pPr>
+      <w:r>
+        <w:t>Dp_plot = 12*t_plot**2 - 36*t_plot + 24</w:t>
+      </w:r>
+    </w:p>
+    <w:p>
+      <w:pPr>
+        <w:spacing w:after="0"/>
+        <w:ind w:left="283"/>
+      </w:pPr>
+    </w:p>
+    <w:p>
+      <w:pPr>
+        <w:spacing w:after="0"/>
+        <w:ind w:left="283"/>
+      </w:pPr>
+      <w:r>
+        <w:t># --- Top plot: D(t) ---</w:t>
+      </w:r>
+    </w:p>
+    <w:p>
+      <w:pPr>
+        <w:spacing w:after="0"/>
+        <w:ind w:left="283"/>
+      </w:pPr>
+      <w:r>
+        <w:t>ax1.plot(t_plot, D_plot, color='#2c7bb6', linewidth=2, label='D(t)')</w:t>
+      </w:r>
+    </w:p>
+    <w:p>
+      <w:pPr>
+        <w:spacing w:after="0"/>
+        <w:ind w:left="283"/>
+      </w:pPr>
+    </w:p>
+    <w:p>
+      <w:pPr>
+        <w:spacing w:after="0"/>
+        <w:ind w:left="283"/>
+      </w:pPr>
+      <w:r>
+        <w:t># Mark critical points</w:t>
+      </w:r>
+    </w:p>
+    <w:p>
+      <w:pPr>
+        <w:spacing w:after="0"/>
+        <w:ind w:left="283"/>
+      </w:pPr>
+      <w:r>
+        <w:t>ax1.scatter(1, 100, color='#d7191c', s=80, zorder=5, label=f'Local max (t=1, D=100)')</w:t>
+      </w:r>
+    </w:p>
+    <w:p>
+      <w:pPr>
+        <w:spacing w:after="0"/>
+        <w:ind w:left="283"/>
+      </w:pPr>
+      <w:r>
+        <w:t>ax1.scatter(2, 98, color='#fdae61', s=80, zorder=5, label=f'Local min (t=2, D=98)')</w:t>
+      </w:r>
+    </w:p>
+    <w:p>
+      <w:pPr>
+        <w:spacing w:after="0"/>
+        <w:ind w:left="283"/>
+      </w:pPr>
+      <w:r>
+        <w:t>ax1.axvline(1.5, color='gray', linestyle=':', alpha=0.5, label=f'Inflection (t=1.5)')</w:t>
+      </w:r>
+    </w:p>
+    <w:p>
+      <w:pPr>
+        <w:spacing w:after="0"/>
+        <w:ind w:left="283"/>
+      </w:pPr>
+    </w:p>
+    <w:p>
+      <w:pPr>
+        <w:spacing w:after="0"/>
+        <w:ind w:left="283"/>
+      </w:pPr>
+      <w:r>
+        <w:t>ax1.set_ylabel('Demand D(t) (units/hour)', fontsize=11)</w:t>
+      </w:r>
+    </w:p>
+    <w:p>
+      <w:pPr>
+        <w:spacing w:after="0"/>
+        <w:ind w:left="283"/>
+      </w:pPr>
+      <w:r>
+        <w:t>ax1.set_title('Demand Over Time - D(t) with Critical Points', fontsize=13, fontweight='bold')</w:t>
+      </w:r>
+    </w:p>
+    <w:p>
+      <w:pPr>
+        <w:spacing w:after="0"/>
+        <w:ind w:left="283"/>
+      </w:pPr>
+      <w:r>
+        <w:t>ax1.legend(fontsize=9, loc='lower right')</w:t>
+      </w:r>
+    </w:p>
+    <w:p>
+      <w:pPr>
+        <w:spacing w:after="0"/>
+        <w:ind w:left="283"/>
+      </w:pPr>
+      <w:r>
+        <w:t>ax1.set_ylim(88, 105)</w:t>
+      </w:r>
+    </w:p>
+    <w:p>
+      <w:pPr>
+        <w:spacing w:after="0"/>
+        <w:ind w:left="283"/>
+      </w:pPr>
+    </w:p>
+    <w:p>
+      <w:pPr>
+        <w:spacing w:after="0"/>
+        <w:ind w:left="283"/>
+      </w:pPr>
+      <w:r>
+        <w:t># --- Bottom plot: D'(t) ---</w:t>
+      </w:r>
+    </w:p>
+    <w:p>
+      <w:pPr>
+        <w:spacing w:after="0"/>
+        <w:ind w:left="283"/>
+      </w:pPr>
+      <w:r>
+        <w:t>ax2.plot(t_plot, Dp_plot, color='#d7191c', linewidth=2, label="D'(t)")</w:t>
+      </w:r>
+    </w:p>
+    <w:p>
+      <w:pPr>
+        <w:spacing w:after="0"/>
+        <w:ind w:left="283"/>
+      </w:pPr>
+      <w:r>
+        <w:t>ax2.axhline(0, color='black', linewidth=0.5, linestyle='-', alpha=0.5)</w:t>
+      </w:r>
+    </w:p>
+    <w:p>
+      <w:pPr>
+        <w:spacing w:after="0"/>
+        <w:ind w:left="283"/>
+      </w:pPr>
+    </w:p>
+    <w:p>
+      <w:pPr>
+        <w:spacing w:after="0"/>
+        <w:ind w:left="283"/>
+      </w:pPr>
+      <w:r>
+        <w:t># Mark where D'(t)=0</w:t>
+      </w:r>
+    </w:p>
+    <w:p>
+      <w:pPr>
+        <w:spacing w:after="0"/>
+        <w:ind w:left="283"/>
+      </w:pPr>
+      <w:r>
+        <w:t>ax2.scatter(1, 0, color='#d7191c', s=80, zorder=5)</w:t>
+      </w:r>
+    </w:p>
+    <w:p>
+      <w:pPr>
+        <w:spacing w:after="0"/>
+        <w:ind w:left="283"/>
+      </w:pPr>
+      <w:r>
+        <w:t>ax2.scatter(2, 0, color='#fdae61', s=80, zorder=5)</w:t>
+      </w:r>
+    </w:p>
+    <w:p>
+      <w:pPr>
+        <w:spacing w:after="0"/>
+        <w:ind w:left="283"/>
+      </w:pPr>
+      <w:r>
+        <w:t>ax2.axvline(1.5, color='gray', linestyle=':', alpha=0.5)</w:t>
+      </w:r>
+    </w:p>
+    <w:p>
+      <w:pPr>
+        <w:spacing w:after="0"/>
+        <w:ind w:left="283"/>
+      </w:pPr>
+    </w:p>
+    <w:p>
+      <w:pPr>
+        <w:spacing w:after="0"/>
+        <w:ind w:left="283"/>
+      </w:pPr>
+      <w:r>
+        <w:t># Shade increasing/decreasing regions on D'(t) plot</w:t>
+      </w:r>
+    </w:p>
+    <w:p>
+      <w:pPr>
+        <w:spacing w:after="0"/>
+        <w:ind w:left="283"/>
+      </w:pPr>
+      <w:r>
+        <w:t>ax2.fill_between(t_plot, 0, Dp_plot, where=(Dp_plot &gt; 0),</w:t>
+      </w:r>
+    </w:p>
+    <w:p>
+      <w:pPr>
+        <w:spacing w:after="0"/>
+        <w:ind w:left="283"/>
+      </w:pPr>
+      <w:r>
+        <w:t>                  color='green', alpha=0.15, label='D increasing')</w:t>
+      </w:r>
+    </w:p>
+    <w:p>
+      <w:pPr>
+        <w:spacing w:after="0"/>
+        <w:ind w:left="283"/>
+      </w:pPr>
+      <w:r>
+        <w:t>ax2.fill_between(t_plot, 0, Dp_plot, where=(Dp_plot &lt; 0),</w:t>
+      </w:r>
+    </w:p>
+    <w:p>
+      <w:pPr>
+        <w:spacing w:after="0"/>
+        <w:ind w:left="283"/>
+      </w:pPr>
+      <w:r>
+        <w:t>                  color='red', alpha=0.15, label='D decreasing')</w:t>
+      </w:r>
+    </w:p>
+    <w:p>
+      <w:pPr>
+        <w:spacing w:after="0"/>
+        <w:ind w:left="283"/>
+      </w:pPr>
+    </w:p>
+    <w:p>
+      <w:pPr>
+        <w:spacing w:after="0"/>
+        <w:ind w:left="283"/>
+      </w:pPr>
+      <w:r>
+        <w:t>ax2.set_xlabel('Time t (hours)', fontsize=11)</w:t>
+      </w:r>
+    </w:p>
+    <w:p>
+      <w:pPr>
+        <w:spacing w:after="0"/>
+        <w:ind w:left="283"/>
+      </w:pPr>
+      <w:r>
+        <w:t>ax2.set_ylabel("D'(t) (units/hour^2)", fontsize=11)</w:t>
+      </w:r>
+    </w:p>
+    <w:p>
+      <w:pPr>
+        <w:spacing w:after="0"/>
+        <w:ind w:left="283"/>
+      </w:pPr>
+      <w:r>
+        <w:t>ax2.set_title("D'(t) - Rate of Change of Demand", fontsize=13, fontweight='bold')</w:t>
+      </w:r>
+    </w:p>
+    <w:p>
+      <w:pPr>
+        <w:spacing w:after="0"/>
+        <w:ind w:left="283"/>
+      </w:pPr>
+      <w:r>
+        <w:t>ax2.legend(fontsize=9, loc='upper right')</w:t>
+      </w:r>
+    </w:p>
+    <w:p>
+      <w:pPr>
+        <w:spacing w:after="0"/>
+        <w:ind w:left="283"/>
+      </w:pPr>
+    </w:p>
+    <w:p>
+      <w:pPr>
+        <w:spacing w:after="0"/>
+        <w:ind w:left="283"/>
+      </w:pPr>
+      <w:r>
+        <w:t>plt.tight_layout()</w:t>
+      </w:r>
+    </w:p>
+    <w:p>
+      <w:pPr>
+        <w:spacing w:after="0"/>
+        <w:ind w:left="283"/>
+      </w:pPr>
+    </w:p>
+    <w:p>
+      <w:pPr>
+        <w:spacing w:after="0"/>
+        <w:ind w:left="283"/>
+      </w:pPr>
+      <w:r>
+        <w:t># Save figure</w:t>
+      </w:r>
+    </w:p>
+    <w:p>
+      <w:pPr>
+        <w:spacing w:after="0"/>
+        <w:ind w:left="283"/>
+      </w:pPr>
+      <w:r>
+        <w:t>fig_path = 'figures/fig_task2_demand_curve.png'</w:t>
+      </w:r>
+    </w:p>
+    <w:p>
+      <w:pPr>
+        <w:spacing w:after="0"/>
+        <w:ind w:left="283"/>
+      </w:pPr>
+      <w:r>
+        <w:t>plt.savefig(fig_path, dpi=150)</w:t>
+      </w:r>
+    </w:p>
+    <w:p>
+      <w:pPr>
+        <w:spacing w:after="0"/>
+        <w:ind w:left="283"/>
+      </w:pPr>
+      <w:r>
+        <w:t>print(f"Figure saved to '{fig_path}'")</w:t>
+      </w:r>
+    </w:p>
+    <w:p>
+      <w:pPr>
+        <w:spacing w:after="0"/>
+        <w:ind w:left="283"/>
+      </w:pPr>
+    </w:p>
+    <w:p>
+      <w:pPr>
+        <w:spacing w:after="0"/>
+        <w:ind w:left="283"/>
+      </w:pPr>
+      <w:r>
+        <w:t># Verification using sympy - confirm critical points numerically</w:t>
+      </w:r>
+    </w:p>
+    <w:p>
+      <w:pPr>
+        <w:spacing w:after="0"/>
+        <w:ind w:left="283"/>
+      </w:pPr>
+      <w:r>
+        <w:t>print("\n" + "-" * 50)</w:t>
+      </w:r>
+    </w:p>
+    <w:p>
+      <w:pPr>
+        <w:spacing w:after="0"/>
+        <w:ind w:left="283"/>
+      </w:pPr>
+      <w:r>
+        <w:t>print("SYMPY VERIFICATION")</w:t>
+      </w:r>
+    </w:p>
+    <w:p>
+      <w:pPr>
+        <w:spacing w:after="0"/>
+        <w:ind w:left="283"/>
+      </w:pPr>
+      <w:r>
+        <w:t>print("-" * 50)</w:t>
+      </w:r>
+    </w:p>
+    <w:p>
+      <w:pPr>
+        <w:spacing w:after="0"/>
+        <w:ind w:left="283"/>
+      </w:pPr>
+      <w:r>
+        <w:t>critical_solutions = sp.solve(D_prime_sym, t_sym)</w:t>
+      </w:r>
+    </w:p>
+    <w:p>
+      <w:pPr>
+        <w:spacing w:after="0"/>
+        <w:ind w:left="283"/>
+      </w:pPr>
+      <w:r>
+        <w:t>print(f"Critical points from sympy: {critical_solutions}")</w:t>
+      </w:r>
+    </w:p>
+    <w:p>
+      <w:pPr>
+        <w:spacing w:after="0"/>
+        <w:ind w:left="283"/>
+      </w:pPr>
+      <w:r>
+        <w:t>inflection_solution = sp.solve(D_double_sym, t_sym)</w:t>
+      </w:r>
+    </w:p>
+    <w:p>
+      <w:pPr>
+        <w:spacing w:after="0"/>
+        <w:ind w:left="283"/>
+      </w:pPr>
+      <w:r>
+        <w:t>print(f"Inflection point from sympy: {inflection_solution}")</w:t>
+      </w:r>
+    </w:p>
+    <w:p>
+      <w:pPr>
+        <w:spacing w:after="0"/>
+        <w:ind w:left="283"/>
+      </w:pPr>
+    </w:p>
+    <w:p>
+      <w:pPr>
+        <w:spacing w:after="0"/>
+        <w:ind w:left="283"/>
+      </w:pPr>
+      <w:r>
+        <w:t>print("\n" + "=" * 60)</w:t>
+      </w:r>
+    </w:p>
+    <w:p>
+      <w:pPr>
+        <w:spacing w:after="0"/>
+        <w:ind w:left="283"/>
+      </w:pPr>
+      <w:r>
+        <w:t>print("TASK 2 COMPLETE")</w:t>
+      </w:r>
+    </w:p>
+    <w:p>
+      <w:pPr>
+        <w:spacing w:after="0"/>
+        <w:ind w:left="283"/>
+      </w:pPr>
+      <w:r>
+        <w:t>print("=" * 60)</w:t>
+      </w:r>
     </w:p>
     <w:p>
       <w:pPr>
@@ -6815,6 +9430,56 @@
     </w:sectPr>
   </w:body>
 </w:document>
+</file>
+
+<file path=word/endnotes.xml><?xml version="1.0" encoding="utf-8"?>
+<w:endnotes xmlns:wpc="http://schemas.microsoft.com/office/word/2010/wordprocessingCanvas" xmlns:cx="http://schemas.microsoft.com/office/drawing/2014/chartex" xmlns:cx1="http://schemas.microsoft.com/office/drawing/2015/9/8/chartex" xmlns:cx2="http://schemas.microsoft.com/office/drawing/2015/10/21/chartex" xmlns:cx3="http://schemas.microsoft.com/office/drawing/2016/5/9/chartex" xmlns:cx4="http://schemas.microsoft.com/office/drawing/2016/5/10/chartex" xmlns:cx5="http://schemas.microsoft.com/office/drawing/2016/5/11/chartex" xmlns:cx6="http://schemas.microsoft.com/office/drawing/2016/5/12/chartex" xmlns:cx7="http://schemas.microsoft.com/office/drawing/2016/5/13/chartex" xmlns:cx8="http://schemas.microsoft.com/office/drawing/2016/5/14/chartex" xmlns:mc="http://schemas.openxmlformats.org/markup-compatibility/2006" xmlns:aink="http://schemas.microsoft.com/office/drawing/2016/ink" xmlns:am3d="http://schemas.microsoft.com/office/drawing/2017/model3d" xmlns:o="urn:schemas-microsoft-com:office:office" xmlns:oel="http://schemas.microsoft.com/office/2019/extlst" xmlns:r="http://schemas.openxmlformats.org/officeDocument/2006/relationships" xmlns:m="http://schemas.openxmlformats.org/officeDocument/2006/math" xmlns:v="urn:schemas-microsoft-com:vml" xmlns:wp14="http://schemas.microsoft.com/office/word/2010/wordprocessingDrawing" xmlns:wp="http://schemas.openxmlformats.org/drawingml/2006/wordprocessingDrawing" xmlns:w10="urn:schemas-microsoft-com:office:word" xmlns:w="http://schemas.openxmlformats.org/wordprocessingml/2006/main" xmlns:w14="http://schemas.microsoft.com/office/word/2010/wordml" xmlns:w15="http://schemas.microsoft.com/office/word/2012/wordml" xmlns:w16cex="http://schemas.microsoft.com/office/word/2018/wordml/cex" xmlns:w16cid="http://schemas.microsoft.com/office/word/2016/wordml/cid" xmlns:w16="http://schemas.microsoft.com/office/word/2018/wordml" xmlns:w16du="http://schemas.microsoft.com/office/word/2023/wordml/word16du" xmlns:w16sdtdh="http://schemas.microsoft.com/office/word/2020/wordml/sdtdatahash" xmlns:w16sdtfl="http://schemas.microsoft.com/office/word/2024/wordml/sdtformatlock" xmlns:w16se="http://schemas.microsoft.com/office/word/2015/wordml/symex" xmlns:wpg="http://schemas.microsoft.com/office/word/2010/wordprocessingGroup" xmlns:wpi="http://schemas.microsoft.com/office/word/2010/wordprocessingInk" xmlns:wne="http://schemas.microsoft.com/office/word/2006/wordml" xmlns:wps="http://schemas.microsoft.com/office/word/2010/wordprocessingShape" mc:Ignorable="w14 w15 w16se w16cid w16 w16cex w16sdtdh w16sdtfl w16du wp14">
+  <w:endnote w:type="separator" w:id="-1">
+    <w:p>
+      <w:pPr>
+        <w:spacing w:after="0" w:line="240" w:lineRule="auto"/>
+      </w:pPr>
+      <w:r>
+        <w:separator/>
+      </w:r>
+    </w:p>
+  </w:endnote>
+  <w:endnote w:type="continuationSeparator" w:id="0">
+    <w:p>
+      <w:pPr>
+        <w:spacing w:after="0" w:line="240" w:lineRule="auto"/>
+      </w:pPr>
+      <w:r>
+        <w:continuationSeparator/>
+      </w:r>
+    </w:p>
+  </w:endnote>
+</w:endnotes>
+</file>
+
+<file path=word/footnotes.xml><?xml version="1.0" encoding="utf-8"?>
+<w:footnotes xmlns:wpc="http://schemas.microsoft.com/office/word/2010/wordprocessingCanvas" xmlns:cx="http://schemas.microsoft.com/office/drawing/2014/chartex" xmlns:cx1="http://schemas.microsoft.com/office/drawing/2015/9/8/chartex" xmlns:cx2="http://schemas.microsoft.com/office/drawing/2015/10/21/chartex" xmlns:cx3="http://schemas.microsoft.com/office/drawing/2016/5/9/chartex" xmlns:cx4="http://schemas.microsoft.com/office/drawing/2016/5/10/chartex" xmlns:cx5="http://schemas.microsoft.com/office/drawing/2016/5/11/chartex" xmlns:cx6="http://schemas.microsoft.com/office/drawing/2016/5/12/chartex" xmlns:cx7="http://schemas.microsoft.com/office/drawing/2016/5/13/chartex" xmlns:cx8="http://schemas.microsoft.com/office/drawing/2016/5/14/chartex" xmlns:mc="http://schemas.openxmlformats.org/markup-compatibility/2006" xmlns:aink="http://schemas.microsoft.com/office/drawing/2016/ink" xmlns:am3d="http://schemas.microsoft.com/office/drawing/2017/model3d" xmlns:o="urn:schemas-microsoft-com:office:office" xmlns:oel="http://schemas.microsoft.com/office/2019/extlst" xmlns:r="http://schemas.openxmlformats.org/officeDocument/2006/relationships" xmlns:m="http://schemas.openxmlformats.org/officeDocument/2006/math" xmlns:v="urn:schemas-microsoft-com:vml" xmlns:wp14="http://schemas.microsoft.com/office/word/2010/wordprocessingDrawing" xmlns:wp="http://schemas.openxmlformats.org/drawingml/2006/wordprocessingDrawing" xmlns:w10="urn:schemas-microsoft-com:office:word" xmlns:w="http://schemas.openxmlformats.org/wordprocessingml/2006/main" xmlns:w14="http://schemas.microsoft.com/office/word/2010/wordml" xmlns:w15="http://schemas.microsoft.com/office/word/2012/wordml" xmlns:w16cex="http://schemas.microsoft.com/office/word/2018/wordml/cex" xmlns:w16cid="http://schemas.microsoft.com/office/word/2016/wordml/cid" xmlns:w16="http://schemas.microsoft.com/office/word/2018/wordml" xmlns:w16du="http://schemas.microsoft.com/office/word/2023/wordml/word16du" xmlns:w16sdtdh="http://schemas.microsoft.com/office/word/2020/wordml/sdtdatahash" xmlns:w16sdtfl="http://schemas.microsoft.com/office/word/2024/wordml/sdtformatlock" xmlns:w16se="http://schemas.microsoft.com/office/word/2015/wordml/symex" xmlns:wpg="http://schemas.microsoft.com/office/word/2010/wordprocessingGroup" xmlns:wpi="http://schemas.microsoft.com/office/word/2010/wordprocessingInk" xmlns:wne="http://schemas.microsoft.com/office/word/2006/wordml" xmlns:wps="http://schemas.microsoft.com/office/word/2010/wordprocessingShape" mc:Ignorable="w14 w15 w16se w16cid w16 w16cex w16sdtdh w16sdtfl w16du wp14">
+  <w:footnote w:type="separator" w:id="-1">
+    <w:p>
+      <w:pPr>
+        <w:spacing w:after="0" w:line="240" w:lineRule="auto"/>
+      </w:pPr>
+      <w:r>
+        <w:separator/>
+      </w:r>
+    </w:p>
+  </w:footnote>
+  <w:footnote w:type="continuationSeparator" w:id="0">
+    <w:p>
+      <w:pPr>
+        <w:spacing w:after="0" w:line="240" w:lineRule="auto"/>
+      </w:pPr>
+      <w:r>
+        <w:continuationSeparator/>
+      </w:r>
+    </w:p>
+  </w:footnote>
+</w:footnotes>
 </file>
 
 <file path=word/numbering.xml><?xml version="1.0" encoding="utf-8"?>
@@ -7627,7 +10292,6 @@
   <w:style w:type="character" w:default="1" w:styleId="DefaultParagraphFont">
     <w:name w:val="Default Paragraph Font"/>
     <w:uiPriority w:val="1"/>
-    <w:semiHidden/>
     <w:unhideWhenUsed/>
   </w:style>
   <w:style w:type="table" w:default="1" w:styleId="TableNormal">
@@ -16543,7 +19207,7 @@
       </w:tcPr>
     </w:tblStylePr>
   </w:style>
-  <w:style w:type="table" w:styleId="ColourfulShading">
+  <w:style w:type="table" w:styleId="ColorfulShading">
     <w:name w:val="Colorful Shading"/>
     <w:basedOn w:val="TableNormal"/>
     <w:uiPriority w:val="71"/>
@@ -16658,7 +19322,7 @@
       </w:rPr>
     </w:tblStylePr>
   </w:style>
-  <w:style w:type="table" w:styleId="ColourfulShadingAccent1">
+  <w:style w:type="table" w:styleId="ColorfulShading-Accent1">
     <w:name w:val="Colorful Shading Accent 1"/>
     <w:basedOn w:val="TableNormal"/>
     <w:uiPriority w:val="71"/>
@@ -16773,7 +19437,7 @@
       </w:rPr>
     </w:tblStylePr>
   </w:style>
-  <w:style w:type="table" w:styleId="ColourfulShadingAccent2">
+  <w:style w:type="table" w:styleId="ColorfulShading-Accent2">
     <w:name w:val="Colorful Shading Accent 2"/>
     <w:basedOn w:val="TableNormal"/>
     <w:uiPriority w:val="71"/>
@@ -16888,7 +19552,7 @@
       </w:rPr>
     </w:tblStylePr>
   </w:style>
-  <w:style w:type="table" w:styleId="ColourfulShadingAccent3">
+  <w:style w:type="table" w:styleId="ColorfulShading-Accent3">
     <w:name w:val="Colorful Shading Accent 3"/>
     <w:basedOn w:val="TableNormal"/>
     <w:uiPriority w:val="71"/>
@@ -16993,7 +19657,7 @@
       </w:tcPr>
     </w:tblStylePr>
   </w:style>
-  <w:style w:type="table" w:styleId="ColourfulShadingAccent4">
+  <w:style w:type="table" w:styleId="ColorfulShading-Accent4">
     <w:name w:val="Colorful Shading Accent 4"/>
     <w:basedOn w:val="TableNormal"/>
     <w:uiPriority w:val="71"/>
@@ -17108,7 +19772,7 @@
       </w:rPr>
     </w:tblStylePr>
   </w:style>
-  <w:style w:type="table" w:styleId="ColourfulShadingAccent5">
+  <w:style w:type="table" w:styleId="ColorfulShading-Accent5">
     <w:name w:val="Colorful Shading Accent 5"/>
     <w:basedOn w:val="TableNormal"/>
     <w:uiPriority w:val="71"/>
@@ -17223,7 +19887,7 @@
       </w:rPr>
     </w:tblStylePr>
   </w:style>
-  <w:style w:type="table" w:styleId="ColourfulShadingAccent6">
+  <w:style w:type="table" w:styleId="ColorfulShading-Accent6">
     <w:name w:val="Colorful Shading Accent 6"/>
     <w:basedOn w:val="TableNormal"/>
     <w:uiPriority w:val="71"/>
@@ -17338,7 +20002,7 @@
       </w:rPr>
     </w:tblStylePr>
   </w:style>
-  <w:style w:type="table" w:styleId="ColourfulList">
+  <w:style w:type="table" w:styleId="ColorfulList">
     <w:name w:val="Colorful List"/>
     <w:basedOn w:val="TableNormal"/>
     <w:uiPriority w:val="72"/>
@@ -17417,7 +20081,7 @@
       </w:tcPr>
     </w:tblStylePr>
   </w:style>
-  <w:style w:type="table" w:styleId="ColourfulListAccent1">
+  <w:style w:type="table" w:styleId="ColorfulList-Accent1">
     <w:name w:val="Colorful List Accent 1"/>
     <w:basedOn w:val="TableNormal"/>
     <w:uiPriority w:val="72"/>
@@ -17496,7 +20160,7 @@
       </w:tcPr>
     </w:tblStylePr>
   </w:style>
-  <w:style w:type="table" w:styleId="ColourfulListAccent2">
+  <w:style w:type="table" w:styleId="ColorfulList-Accent2">
     <w:name w:val="Colorful List Accent 2"/>
     <w:basedOn w:val="TableNormal"/>
     <w:uiPriority w:val="72"/>
@@ -17575,7 +20239,7 @@
       </w:tcPr>
     </w:tblStylePr>
   </w:style>
-  <w:style w:type="table" w:styleId="ColourfulListAccent3">
+  <w:style w:type="table" w:styleId="ColorfulList-Accent3">
     <w:name w:val="Colorful List Accent 3"/>
     <w:basedOn w:val="TableNormal"/>
     <w:uiPriority w:val="72"/>
@@ -17654,7 +20318,7 @@
       </w:tcPr>
     </w:tblStylePr>
   </w:style>
-  <w:style w:type="table" w:styleId="ColourfulListAccent4">
+  <w:style w:type="table" w:styleId="ColorfulList-Accent4">
     <w:name w:val="Colorful List Accent 4"/>
     <w:basedOn w:val="TableNormal"/>
     <w:uiPriority w:val="72"/>
@@ -17733,7 +20397,7 @@
       </w:tcPr>
     </w:tblStylePr>
   </w:style>
-  <w:style w:type="table" w:styleId="ColourfulListAccent5">
+  <w:style w:type="table" w:styleId="ColorfulList-Accent5">
     <w:name w:val="Colorful List Accent 5"/>
     <w:basedOn w:val="TableNormal"/>
     <w:uiPriority w:val="72"/>
@@ -17812,7 +20476,7 @@
       </w:tcPr>
     </w:tblStylePr>
   </w:style>
-  <w:style w:type="table" w:styleId="ColourfulListAccent6">
+  <w:style w:type="table" w:styleId="ColorfulList-Accent6">
     <w:name w:val="Colorful List Accent 6"/>
     <w:basedOn w:val="TableNormal"/>
     <w:uiPriority w:val="72"/>
@@ -17891,7 +20555,7 @@
       </w:tcPr>
     </w:tblStylePr>
   </w:style>
-  <w:style w:type="table" w:styleId="ColourfulGrid">
+  <w:style w:type="table" w:styleId="ColorfulGrid">
     <w:name w:val="Colorful Grid"/>
     <w:basedOn w:val="TableNormal"/>
     <w:uiPriority w:val="73"/>
@@ -17964,7 +20628,7 @@
       </w:tcPr>
     </w:tblStylePr>
   </w:style>
-  <w:style w:type="table" w:styleId="ColourfulGridAccent1">
+  <w:style w:type="table" w:styleId="ColorfulGrid-Accent1">
     <w:name w:val="Colorful Grid Accent 1"/>
     <w:basedOn w:val="TableNormal"/>
     <w:uiPriority w:val="73"/>
@@ -18037,7 +20701,7 @@
       </w:tcPr>
     </w:tblStylePr>
   </w:style>
-  <w:style w:type="table" w:styleId="ColourfulGridAccent2">
+  <w:style w:type="table" w:styleId="ColorfulGrid-Accent2">
     <w:name w:val="Colorful Grid Accent 2"/>
     <w:basedOn w:val="TableNormal"/>
     <w:uiPriority w:val="73"/>
@@ -18110,7 +20774,7 @@
       </w:tcPr>
     </w:tblStylePr>
   </w:style>
-  <w:style w:type="table" w:styleId="ColourfulGridAccent3">
+  <w:style w:type="table" w:styleId="ColorfulGrid-Accent3">
     <w:name w:val="Colorful Grid Accent 3"/>
     <w:basedOn w:val="TableNormal"/>
     <w:uiPriority w:val="73"/>
@@ -18183,7 +20847,7 @@
       </w:tcPr>
     </w:tblStylePr>
   </w:style>
-  <w:style w:type="table" w:styleId="ColourfulGridAccent4">
+  <w:style w:type="table" w:styleId="ColorfulGrid-Accent4">
     <w:name w:val="Colorful Grid Accent 4"/>
     <w:basedOn w:val="TableNormal"/>
     <w:uiPriority w:val="73"/>
@@ -18256,7 +20920,7 @@
       </w:tcPr>
     </w:tblStylePr>
   </w:style>
-  <w:style w:type="table" w:styleId="ColourfulGridAccent5">
+  <w:style w:type="table" w:styleId="ColorfulGrid-Accent5">
     <w:name w:val="Colorful Grid Accent 5"/>
     <w:basedOn w:val="TableNormal"/>
     <w:uiPriority w:val="73"/>
@@ -18329,7 +20993,7 @@
       </w:tcPr>
     </w:tblStylePr>
   </w:style>
-  <w:style w:type="table" w:styleId="ColourfulGridAccent6">
+  <w:style w:type="table" w:styleId="ColorfulGrid-Accent6">
     <w:name w:val="Colorful Grid Accent 6"/>
     <w:basedOn w:val="TableNormal"/>
     <w:uiPriority w:val="73"/>

</xml_diff>